<commit_message>
enhance functional report with full case execution details
</commit_message>
<xml_diff>
--- a/jmeter/docs/自动化接口功能测试报告.docx
+++ b/jmeter/docs/自动化接口功能测试报告.docx
@@ -44,7 +44,7 @@
         <w:pStyle w:val="ListBullet"/>
       </w:pPr>
       <w:r>
-        <w:t>核心指标：主流程跑通=否；用例通过率=24.32%（9/37）；样本错误率=53.12%（34/64）</w:t>
+        <w:t>核心指标：主流程跑通=否；用例通过率=24.32%（9/37）；样本错误率=41.18%（56/136）</w:t>
       </w:r>
     </w:p>
     <w:p>
@@ -52,7 +52,7 @@
         <w:pStyle w:val="ListBullet"/>
       </w:pPr>
       <w:r>
-        <w:t>关键失败信号：HTTP500=3，HTTP401=11，EXPECT_OK 失败数=5</w:t>
+        <w:t>关键失败信号：HTTP500=4，HTTP401=12，EXPECT_OK 失败数=5</w:t>
       </w:r>
     </w:p>
     <w:p>
@@ -60,7 +60,7 @@
         <w:pStyle w:val="ListBullet"/>
       </w:pPr>
       <w:r>
-        <w:t>核心问题1：1. [严重] 登录/认证 - FUNC-Login 在 4 账号中 2 账号失败，HTTP 500（2/4），导致正向主链路中断</w:t>
+        <w:t>核心问题1：1. [严重] 登录/认证 - FUNC-Login 出现失败 2/8，状态码分布 {'500': 2, '200': 6}，包含 HTTP 500。</w:t>
       </w:r>
     </w:p>
     <w:p>
@@ -68,7 +68,7 @@
         <w:pStyle w:val="ListBullet"/>
       </w:pPr>
       <w:r>
-        <w:t>核心问题2：2. [严重] 登录态/鉴权 - FUNC-QueryCourseList/FUNC-GetCourseChapterTaskList/FUNC-QuitTeachingTask/FUNC-QuitCourse/FUNC-Logout 出现 401（各 2/4），与前序登录失败链路强相关</w:t>
+        <w:t>核心问题2：2. [严重] 登录态/鉴权链路 - 主链路鉴权相关接口失败 10/40，状态码分布 {'401': 10, '200': 30}，出现 401 Unauthorized。</w:t>
       </w:r>
     </w:p>
     <w:p>
@@ -76,7 +76,7 @@
         <w:pStyle w:val="ListBullet"/>
       </w:pPr>
       <w:r>
-        <w:t>核心问题3：3. [严重] 异常处理 - EX-NoAuth-QueryCourseList[EXPECT_FAIL] 返回 HTTP 500（1/1），异常拦截场景暴露服务端错误而非规范业务失败</w:t>
+        <w:t>核心问题3：3. [严重] 异常处理规范 - EX-NoAuth-QueryCourseList [EXPECT_FAIL] 失败 2/2，返回 HTTP 500，且命中服务端异常特征。</w:t>
       </w:r>
     </w:p>
     <w:p/>
@@ -115,7 +115,7 @@
     </w:p>
     <w:p>
       <w:r>
-        <w:t>编写日期：2026-03-17</w:t>
+        <w:t>编写日期：2026-03-18</w:t>
       </w:r>
     </w:p>
     <w:p>
@@ -1646,7 +1646,7 @@
           </w:tcPr>
           <w:p>
             <w:r>
-              <w:t>FUNC-GetCourseChapterTaskList</w:t>
+              <w:t>EX-CrossAccount-QueryContent [EXPECT_FAIL]</w:t>
             </w:r>
           </w:p>
         </w:tc>
@@ -1656,7 +1656,7 @@
           </w:tcPr>
           <w:p>
             <w:r>
-              <w:t>2/4</w:t>
+              <w:t>2/2</w:t>
             </w:r>
           </w:p>
         </w:tc>
@@ -1666,7 +1666,7 @@
           </w:tcPr>
           <w:p>
             <w:r>
-              <w:t>50.00%</w:t>
+              <w:t>100.00%</w:t>
             </w:r>
           </w:p>
         </w:tc>
@@ -1676,7 +1676,7 @@
           </w:tcPr>
           <w:p>
             <w:r>
-              <w:t>401:2</w:t>
+              <w:t>424:2</w:t>
             </w:r>
           </w:p>
         </w:tc>
@@ -1686,7 +1686,7 @@
           </w:tcPr>
           <w:p>
             <w:r>
-              <w:t>Test failed: text expected to contain /"code":0/:2</w:t>
+              <w:t>Failed Dependency:2</w:t>
             </w:r>
           </w:p>
         </w:tc>
@@ -1698,7 +1698,7 @@
           </w:tcPr>
           <w:p>
             <w:r>
-              <w:t>FUNC-Login</w:t>
+              <w:t>EX-CrossAccount-saveExpAnswerRecord [EXPECT_FAIL]</w:t>
             </w:r>
           </w:p>
         </w:tc>
@@ -1708,7 +1708,7 @@
           </w:tcPr>
           <w:p>
             <w:r>
-              <w:t>2/4</w:t>
+              <w:t>2/2</w:t>
             </w:r>
           </w:p>
         </w:tc>
@@ -1718,7 +1718,7 @@
           </w:tcPr>
           <w:p>
             <w:r>
-              <w:t>50.00%</w:t>
+              <w:t>100.00%</w:t>
             </w:r>
           </w:p>
         </w:tc>
@@ -1728,7 +1728,7 @@
           </w:tcPr>
           <w:p>
             <w:r>
-              <w:t>500:2</w:t>
+              <w:t>424:2</w:t>
             </w:r>
           </w:p>
         </w:tc>
@@ -1738,7 +1738,7 @@
           </w:tcPr>
           <w:p>
             <w:r>
-              <w:t>Test failed: text expected to contain /"code":0/:2</w:t>
+              <w:t>Failed Dependency:2</w:t>
             </w:r>
           </w:p>
         </w:tc>
@@ -1750,7 +1750,7 @@
           </w:tcPr>
           <w:p>
             <w:r>
-              <w:t>FUNC-Logout</w:t>
+              <w:t>EX-CrossAccount-saveQuestionAnswer [EXPECT_FAIL]</w:t>
             </w:r>
           </w:p>
         </w:tc>
@@ -1760,7 +1760,7 @@
           </w:tcPr>
           <w:p>
             <w:r>
-              <w:t>2/4</w:t>
+              <w:t>2/2</w:t>
             </w:r>
           </w:p>
         </w:tc>
@@ -1770,7 +1770,7 @@
           </w:tcPr>
           <w:p>
             <w:r>
-              <w:t>50.00%</w:t>
+              <w:t>100.00%</w:t>
             </w:r>
           </w:p>
         </w:tc>
@@ -1780,7 +1780,7 @@
           </w:tcPr>
           <w:p>
             <w:r>
-              <w:t>401:2</w:t>
+              <w:t>424:2</w:t>
             </w:r>
           </w:p>
         </w:tc>
@@ -1790,7 +1790,7 @@
           </w:tcPr>
           <w:p>
             <w:r>
-              <w:t>Test failed: text expected to contain /"code":0/:2</w:t>
+              <w:t>Failed Dependency:2</w:t>
             </w:r>
           </w:p>
         </w:tc>
@@ -1802,7 +1802,7 @@
           </w:tcPr>
           <w:p>
             <w:r>
-              <w:t>FUNC-QueryCourseList</w:t>
+              <w:t>EX-EmptyToken-QueryCourseList [EXPECT_FAIL]</w:t>
             </w:r>
           </w:p>
         </w:tc>
@@ -1812,7 +1812,7 @@
           </w:tcPr>
           <w:p>
             <w:r>
-              <w:t>2/4</w:t>
+              <w:t>2/2</w:t>
             </w:r>
           </w:p>
         </w:tc>
@@ -1822,7 +1822,7 @@
           </w:tcPr>
           <w:p>
             <w:r>
-              <w:t>50.00%</w:t>
+              <w:t>100.00%</w:t>
             </w:r>
           </w:p>
         </w:tc>
@@ -1842,7 +1842,7 @@
           </w:tcPr>
           <w:p>
             <w:r>
-              <w:t>Test failed: text expected to contain /"code":0/:2</w:t>
+              <w:t>Unauthorized:2</w:t>
             </w:r>
           </w:p>
         </w:tc>
@@ -1854,7 +1854,7 @@
           </w:tcPr>
           <w:p>
             <w:r>
-              <w:t>FUNC-QuitCourse</w:t>
+              <w:t>EX-FakeToken-QueryCourseList [EXPECT_FAIL]</w:t>
             </w:r>
           </w:p>
         </w:tc>
@@ -1864,7 +1864,7 @@
           </w:tcPr>
           <w:p>
             <w:r>
-              <w:t>2/4</w:t>
+              <w:t>2/2</w:t>
             </w:r>
           </w:p>
         </w:tc>
@@ -1874,7 +1874,7 @@
           </w:tcPr>
           <w:p>
             <w:r>
-              <w:t>50.00%</w:t>
+              <w:t>100.00%</w:t>
             </w:r>
           </w:p>
         </w:tc>
@@ -1884,7 +1884,7 @@
           </w:tcPr>
           <w:p>
             <w:r>
-              <w:t>401:2</w:t>
+              <w:t>424:2</w:t>
             </w:r>
           </w:p>
         </w:tc>
@@ -1894,7 +1894,7 @@
           </w:tcPr>
           <w:p>
             <w:r>
-              <w:t>Test failed: text expected to contain /"code":0/:2</w:t>
+              <w:t>Failed Dependency:2</w:t>
             </w:r>
           </w:p>
         </w:tc>
@@ -1906,7 +1906,7 @@
           </w:tcPr>
           <w:p>
             <w:r>
-              <w:t>FUNC-QuitTeachingTask</w:t>
+              <w:t>EX-HeaderMissing-Logout [EXPECT_FAIL]</w:t>
             </w:r>
           </w:p>
         </w:tc>
@@ -1916,7 +1916,7 @@
           </w:tcPr>
           <w:p>
             <w:r>
-              <w:t>2/4</w:t>
+              <w:t>2/2</w:t>
             </w:r>
           </w:p>
         </w:tc>
@@ -1926,7 +1926,7 @@
           </w:tcPr>
           <w:p>
             <w:r>
-              <w:t>50.00%</w:t>
+              <w:t>100.00%</w:t>
             </w:r>
           </w:p>
         </w:tc>
@@ -1936,7 +1936,7 @@
           </w:tcPr>
           <w:p>
             <w:r>
-              <w:t>401:2</w:t>
+              <w:t>424:2</w:t>
             </w:r>
           </w:p>
         </w:tc>
@@ -1946,7 +1946,7 @@
           </w:tcPr>
           <w:p>
             <w:r>
-              <w:t>Test failed: text expected to contain /"code":0/:2</w:t>
+              <w:t>Failed Dependency:2</w:t>
             </w:r>
           </w:p>
         </w:tc>
@@ -1958,7 +1958,7 @@
           </w:tcPr>
           <w:p>
             <w:r>
-              <w:t>EX-CrossAccount-QueryContent [EXPECT_FAIL]</w:t>
+              <w:t>EX-NoAuth-QueryCourseList [EXPECT_FAIL]</w:t>
             </w:r>
           </w:p>
         </w:tc>
@@ -1968,7 +1968,7 @@
           </w:tcPr>
           <w:p>
             <w:r>
-              <w:t>1/1</w:t>
+              <w:t>2/2</w:t>
             </w:r>
           </w:p>
         </w:tc>
@@ -1988,7 +1988,7 @@
           </w:tcPr>
           <w:p>
             <w:r>
-              <w:t>424:1</w:t>
+              <w:t>500:2</w:t>
             </w:r>
           </w:p>
         </w:tc>
@@ -1998,7 +1998,7 @@
           </w:tcPr>
           <w:p>
             <w:r>
-              <w:t>Failed Dependency:1</w:t>
+              <w:t>Server exception signature detected in exception scenario: EX-NoAuth-QueryCou...:2</w:t>
             </w:r>
           </w:p>
         </w:tc>
@@ -2010,7 +2010,7 @@
           </w:tcPr>
           <w:p>
             <w:r>
-              <w:t>EX-CrossAccount-saveExpAnswerRecord [EXPECT_FAIL]</w:t>
+              <w:t>EX-ReuseToken-AfterLogout [EXPECT_FAIL]</w:t>
             </w:r>
           </w:p>
         </w:tc>
@@ -2020,7 +2020,7 @@
           </w:tcPr>
           <w:p>
             <w:r>
-              <w:t>1/1</w:t>
+              <w:t>2/2</w:t>
             </w:r>
           </w:p>
         </w:tc>
@@ -2040,7 +2040,7 @@
           </w:tcPr>
           <w:p>
             <w:r>
-              <w:t>424:1</w:t>
+              <w:t>424:2</w:t>
             </w:r>
           </w:p>
         </w:tc>
@@ -2050,7 +2050,7 @@
           </w:tcPr>
           <w:p>
             <w:r>
-              <w:t>Failed Dependency:1</w:t>
+              <w:t>Failed Dependency:2</w:t>
             </w:r>
           </w:p>
         </w:tc>
@@ -2062,7 +2062,7 @@
           </w:tcPr>
           <w:p>
             <w:r>
-              <w:t>EX-CrossAccount-saveQuestionAnswer [EXPECT_FAIL]</w:t>
+              <w:t>EX-blockId-empty [EXPECT_FAIL]</w:t>
             </w:r>
           </w:p>
         </w:tc>
@@ -2072,7 +2072,7 @@
           </w:tcPr>
           <w:p>
             <w:r>
-              <w:t>1/1</w:t>
+              <w:t>2/2</w:t>
             </w:r>
           </w:p>
         </w:tc>
@@ -2092,7 +2092,7 @@
           </w:tcPr>
           <w:p>
             <w:r>
-              <w:t>424:1</w:t>
+              <w:t>424:2</w:t>
             </w:r>
           </w:p>
         </w:tc>
@@ -2102,7 +2102,7 @@
           </w:tcPr>
           <w:p>
             <w:r>
-              <w:t>Failed Dependency:1</w:t>
+              <w:t>Failed Dependency:2</w:t>
             </w:r>
           </w:p>
         </w:tc>
@@ -2114,7 +2114,7 @@
           </w:tcPr>
           <w:p>
             <w:r>
-              <w:t>EX-EmptyToken-QueryCourseList [EXPECT_FAIL]</w:t>
+              <w:t>EX-clientKey-compatible [EXPECT_OK]</w:t>
             </w:r>
           </w:p>
         </w:tc>
@@ -2124,7 +2124,7 @@
           </w:tcPr>
           <w:p>
             <w:r>
-              <w:t>1/1</w:t>
+              <w:t>2/2</w:t>
             </w:r>
           </w:p>
         </w:tc>
@@ -2144,7 +2144,7 @@
           </w:tcPr>
           <w:p>
             <w:r>
-              <w:t>401:1</w:t>
+              <w:t>424:2</w:t>
             </w:r>
           </w:p>
         </w:tc>
@@ -2154,7 +2154,7 @@
           </w:tcPr>
           <w:p>
             <w:r>
-              <w:t>Unauthorized:1</w:t>
+              <w:t>Expected success but got business failure: EX-clientKey-compatible [EXPECT_OK...:2</w:t>
             </w:r>
           </w:p>
         </w:tc>
@@ -2166,7 +2166,7 @@
           </w:tcPr>
           <w:p>
             <w:r>
-              <w:t>EX-FakeToken-QueryCourseList [EXPECT_FAIL]</w:t>
+              <w:t>EX-clientVersion-1.0.0 [EXPECT_OK]</w:t>
             </w:r>
           </w:p>
         </w:tc>
@@ -2176,7 +2176,7 @@
           </w:tcPr>
           <w:p>
             <w:r>
-              <w:t>1/1</w:t>
+              <w:t>2/2</w:t>
             </w:r>
           </w:p>
         </w:tc>
@@ -2196,7 +2196,7 @@
           </w:tcPr>
           <w:p>
             <w:r>
-              <w:t>424:1</w:t>
+              <w:t>424:2</w:t>
             </w:r>
           </w:p>
         </w:tc>
@@ -2206,7 +2206,7 @@
           </w:tcPr>
           <w:p>
             <w:r>
-              <w:t>Failed Dependency:1</w:t>
+              <w:t>Expected success but got business failure: EX-clientVersion-1.0.0 [EXPECT_OK]...:2</w:t>
             </w:r>
           </w:p>
         </w:tc>
@@ -2218,7 +2218,7 @@
           </w:tcPr>
           <w:p>
             <w:r>
-              <w:t>EX-HeaderMissing-Logout [EXPECT_FAIL]</w:t>
+              <w:t>EX-clientVersion-V1.0 [EXPECT_OK]</w:t>
             </w:r>
           </w:p>
         </w:tc>
@@ -2228,7 +2228,7 @@
           </w:tcPr>
           <w:p>
             <w:r>
-              <w:t>1/1</w:t>
+              <w:t>2/2</w:t>
             </w:r>
           </w:p>
         </w:tc>
@@ -2248,7 +2248,7 @@
           </w:tcPr>
           <w:p>
             <w:r>
-              <w:t>424:1</w:t>
+              <w:t>424:2</w:t>
             </w:r>
           </w:p>
         </w:tc>
@@ -2258,7 +2258,7 @@
           </w:tcPr>
           <w:p>
             <w:r>
-              <w:t>Failed Dependency:1</w:t>
+              <w:t>Expected success but got business failure: EX-clientVersion-V1.0 [EXPECT_OK] ...:2</w:t>
             </w:r>
           </w:p>
         </w:tc>
@@ -2270,7 +2270,7 @@
           </w:tcPr>
           <w:p>
             <w:r>
-              <w:t>EX-NoAuth-QueryCourseList [EXPECT_FAIL]</w:t>
+              <w:t>EX-clientVersion-v1.0 [EXPECT_OK]</w:t>
             </w:r>
           </w:p>
         </w:tc>
@@ -2280,7 +2280,7 @@
           </w:tcPr>
           <w:p>
             <w:r>
-              <w:t>1/1</w:t>
+              <w:t>2/2</w:t>
             </w:r>
           </w:p>
         </w:tc>
@@ -2300,7 +2300,7 @@
           </w:tcPr>
           <w:p>
             <w:r>
-              <w:t>500:1</w:t>
+              <w:t>424:2</w:t>
             </w:r>
           </w:p>
         </w:tc>
@@ -2310,7 +2310,7 @@
           </w:tcPr>
           <w:p>
             <w:r>
-              <w:t>Server exception signature detected in exception scenario: EX-NoAuth-QueryCou...:1</w:t>
+              <w:t>Expected success but got business failure: EX-clientVersion-v1.0 [EXPECT_OK] ...:2</w:t>
             </w:r>
           </w:p>
         </w:tc>
@@ -2322,7 +2322,7 @@
           </w:tcPr>
           <w:p>
             <w:r>
-              <w:t>EX-ReuseToken-AfterLogout [EXPECT_FAIL]</w:t>
+              <w:t>EX-clientkey-compatible [EXPECT_OK]</w:t>
             </w:r>
           </w:p>
         </w:tc>
@@ -2332,7 +2332,7 @@
           </w:tcPr>
           <w:p>
             <w:r>
-              <w:t>1/1</w:t>
+              <w:t>2/2</w:t>
             </w:r>
           </w:p>
         </w:tc>
@@ -2352,7 +2352,7 @@
           </w:tcPr>
           <w:p>
             <w:r>
-              <w:t>424:1</w:t>
+              <w:t>424:2</w:t>
             </w:r>
           </w:p>
         </w:tc>
@@ -2362,7 +2362,7 @@
           </w:tcPr>
           <w:p>
             <w:r>
-              <w:t>Failed Dependency:1</w:t>
+              <w:t>Expected success but got business failure: EX-clientkey-compatible [EXPECT_OK...:2</w:t>
             </w:r>
           </w:p>
         </w:tc>
@@ -2374,7 +2374,7 @@
           </w:tcPr>
           <w:p>
             <w:r>
-              <w:t>EX-blockId-empty [EXPECT_FAIL]</w:t>
+              <w:t>EX-courseId-empty [EXPECT_FAIL]</w:t>
             </w:r>
           </w:p>
         </w:tc>
@@ -2384,7 +2384,7 @@
           </w:tcPr>
           <w:p>
             <w:r>
-              <w:t>1/1</w:t>
+              <w:t>2/2</w:t>
             </w:r>
           </w:p>
         </w:tc>
@@ -2404,7 +2404,7 @@
           </w:tcPr>
           <w:p>
             <w:r>
-              <w:t>424:1</w:t>
+              <w:t>424:2</w:t>
             </w:r>
           </w:p>
         </w:tc>
@@ -2414,7 +2414,7 @@
           </w:tcPr>
           <w:p>
             <w:r>
-              <w:t>Failed Dependency:1</w:t>
+              <w:t>Failed Dependency:2</w:t>
             </w:r>
           </w:p>
         </w:tc>
@@ -2426,7 +2426,7 @@
           </w:tcPr>
           <w:p>
             <w:r>
-              <w:t>EX-clientKey-compatible [EXPECT_OK]</w:t>
+              <w:t>EX-courseId-illegal [EXPECT_FAIL]</w:t>
             </w:r>
           </w:p>
         </w:tc>
@@ -2436,7 +2436,7 @@
           </w:tcPr>
           <w:p>
             <w:r>
-              <w:t>1/1</w:t>
+              <w:t>2/2</w:t>
             </w:r>
           </w:p>
         </w:tc>
@@ -2456,7 +2456,7 @@
           </w:tcPr>
           <w:p>
             <w:r>
-              <w:t>424:1</w:t>
+              <w:t>424:2</w:t>
             </w:r>
           </w:p>
         </w:tc>
@@ -2466,7 +2466,7 @@
           </w:tcPr>
           <w:p>
             <w:r>
-              <w:t>Expected success but got business failure: EX-clientKey-compatible [EXPECT_OK...:1</w:t>
+              <w:t>Failed Dependency:2</w:t>
             </w:r>
           </w:p>
         </w:tc>
@@ -2478,7 +2478,7 @@
           </w:tcPr>
           <w:p>
             <w:r>
-              <w:t>EX-clientVersion-1.0.0 [EXPECT_OK]</w:t>
+              <w:t>EX-teachingTaskId-empty [EXPECT_FAIL]</w:t>
             </w:r>
           </w:p>
         </w:tc>
@@ -2488,7 +2488,7 @@
           </w:tcPr>
           <w:p>
             <w:r>
-              <w:t>1/1</w:t>
+              <w:t>2/2</w:t>
             </w:r>
           </w:p>
         </w:tc>
@@ -2508,7 +2508,7 @@
           </w:tcPr>
           <w:p>
             <w:r>
-              <w:t>424:1</w:t>
+              <w:t>424:2</w:t>
             </w:r>
           </w:p>
         </w:tc>
@@ -2518,7 +2518,7 @@
           </w:tcPr>
           <w:p>
             <w:r>
-              <w:t>Expected success but got business failure: EX-clientVersion-1.0.0 [EXPECT_OK]...:1</w:t>
+              <w:t>Failed Dependency:2</w:t>
             </w:r>
           </w:p>
         </w:tc>
@@ -2530,7 +2530,7 @@
           </w:tcPr>
           <w:p>
             <w:r>
-              <w:t>EX-clientVersion-V1.0 [EXPECT_OK]</w:t>
+              <w:t>EX-teachingTaskId-illegal [EXPECT_FAIL]</w:t>
             </w:r>
           </w:p>
         </w:tc>
@@ -2540,7 +2540,7 @@
           </w:tcPr>
           <w:p>
             <w:r>
-              <w:t>1/1</w:t>
+              <w:t>2/2</w:t>
             </w:r>
           </w:p>
         </w:tc>
@@ -2560,7 +2560,7 @@
           </w:tcPr>
           <w:p>
             <w:r>
-              <w:t>424:1</w:t>
+              <w:t>424:2</w:t>
             </w:r>
           </w:p>
         </w:tc>
@@ -2570,7 +2570,7 @@
           </w:tcPr>
           <w:p>
             <w:r>
-              <w:t>Expected success but got business failure: EX-clientVersion-V1.0 [EXPECT_OK] ...:1</w:t>
+              <w:t>Failed Dependency:2</w:t>
             </w:r>
           </w:p>
         </w:tc>
@@ -2582,7 +2582,7 @@
           </w:tcPr>
           <w:p>
             <w:r>
-              <w:t>EX-clientVersion-v1.0 [EXPECT_OK]</w:t>
+              <w:t>EX-userReportId-empty [EXPECT_FAIL]</w:t>
             </w:r>
           </w:p>
         </w:tc>
@@ -2592,7 +2592,7 @@
           </w:tcPr>
           <w:p>
             <w:r>
-              <w:t>1/1</w:t>
+              <w:t>2/2</w:t>
             </w:r>
           </w:p>
         </w:tc>
@@ -2612,7 +2612,7 @@
           </w:tcPr>
           <w:p>
             <w:r>
-              <w:t>424:1</w:t>
+              <w:t>424:2</w:t>
             </w:r>
           </w:p>
         </w:tc>
@@ -2622,7 +2622,7 @@
           </w:tcPr>
           <w:p>
             <w:r>
-              <w:t>Expected success but got business failure: EX-clientVersion-v1.0 [EXPECT_OK] ...:1</w:t>
+              <w:t>Failed Dependency:2</w:t>
             </w:r>
           </w:p>
         </w:tc>
@@ -2634,7 +2634,7 @@
           </w:tcPr>
           <w:p>
             <w:r>
-              <w:t>EX-clientkey-compatible [EXPECT_OK]</w:t>
+              <w:t>FUNC-GetCourseChapterTaskList</w:t>
             </w:r>
           </w:p>
         </w:tc>
@@ -2644,7 +2644,7 @@
           </w:tcPr>
           <w:p>
             <w:r>
-              <w:t>1/1</w:t>
+              <w:t>2/8</w:t>
             </w:r>
           </w:p>
         </w:tc>
@@ -2654,7 +2654,7 @@
           </w:tcPr>
           <w:p>
             <w:r>
-              <w:t>100.00%</w:t>
+              <w:t>25.00%</w:t>
             </w:r>
           </w:p>
         </w:tc>
@@ -2664,7 +2664,7 @@
           </w:tcPr>
           <w:p>
             <w:r>
-              <w:t>424:1</w:t>
+              <w:t>401:2</w:t>
             </w:r>
           </w:p>
         </w:tc>
@@ -2674,7 +2674,7 @@
           </w:tcPr>
           <w:p>
             <w:r>
-              <w:t>Expected success but got business failure: EX-clientkey-compatible [EXPECT_OK...:1</w:t>
+              <w:t>Test failed: text expected to contain /"code":0/:2</w:t>
             </w:r>
           </w:p>
         </w:tc>
@@ -2684,7 +2684,3555 @@
     <w:p/>
     <w:p>
       <w:r>
-        <w:t>6.5 关键图表</w:t>
+        <w:t>6.5 用例执行详情（全量）</w:t>
+      </w:r>
+    </w:p>
+    <w:tbl>
+      <w:tblPr>
+        <w:tblStyle w:val="TableGrid"/>
+        <w:tblW w:type="auto" w:w="0"/>
+        <w:tblLook w:firstColumn="1" w:firstRow="1" w:lastColumn="0" w:lastRow="0" w:noHBand="0" w:noVBand="1" w:val="04A0"/>
+      </w:tblPr>
+      <w:tblGrid>
+        <w:gridCol w:w="960"/>
+        <w:gridCol w:w="960"/>
+        <w:gridCol w:w="960"/>
+        <w:gridCol w:w="960"/>
+        <w:gridCol w:w="960"/>
+        <w:gridCol w:w="960"/>
+        <w:gridCol w:w="960"/>
+        <w:gridCol w:w="960"/>
+        <w:gridCol w:w="960"/>
+      </w:tblGrid>
+      <w:tr>
+        <w:tc>
+          <w:tcPr>
+            <w:tcW w:type="dxa" w:w="960"/>
+          </w:tcPr>
+          <w:p>
+            <w:r>
+              <w:rPr>
+                <w:b/>
+              </w:rPr>
+              <w:t>用例标签</w:t>
+            </w:r>
+          </w:p>
+        </w:tc>
+        <w:tc>
+          <w:tcPr>
+            <w:tcW w:type="dxa" w:w="960"/>
+          </w:tcPr>
+          <w:p>
+            <w:r>
+              <w:rPr>
+                <w:b/>
+              </w:rPr>
+              <w:t>分类</w:t>
+            </w:r>
+          </w:p>
+        </w:tc>
+        <w:tc>
+          <w:tcPr>
+            <w:tcW w:type="dxa" w:w="960"/>
+          </w:tcPr>
+          <w:p>
+            <w:r>
+              <w:rPr>
+                <w:b/>
+              </w:rPr>
+              <w:t>期望</w:t>
+            </w:r>
+          </w:p>
+        </w:tc>
+        <w:tc>
+          <w:tcPr>
+            <w:tcW w:type="dxa" w:w="960"/>
+          </w:tcPr>
+          <w:p>
+            <w:r>
+              <w:rPr>
+                <w:b/>
+              </w:rPr>
+              <w:t>执行次数</w:t>
+            </w:r>
+          </w:p>
+        </w:tc>
+        <w:tc>
+          <w:tcPr>
+            <w:tcW w:type="dxa" w:w="960"/>
+          </w:tcPr>
+          <w:p>
+            <w:r>
+              <w:rPr>
+                <w:b/>
+              </w:rPr>
+              <w:t>通过</w:t>
+            </w:r>
+          </w:p>
+        </w:tc>
+        <w:tc>
+          <w:tcPr>
+            <w:tcW w:type="dxa" w:w="960"/>
+          </w:tcPr>
+          <w:p>
+            <w:r>
+              <w:rPr>
+                <w:b/>
+              </w:rPr>
+              <w:t>失败</w:t>
+            </w:r>
+          </w:p>
+        </w:tc>
+        <w:tc>
+          <w:tcPr>
+            <w:tcW w:type="dxa" w:w="960"/>
+          </w:tcPr>
+          <w:p>
+            <w:r>
+              <w:rPr>
+                <w:b/>
+              </w:rPr>
+              <w:t>状态码分布</w:t>
+            </w:r>
+          </w:p>
+        </w:tc>
+        <w:tc>
+          <w:tcPr>
+            <w:tcW w:type="dxa" w:w="960"/>
+          </w:tcPr>
+          <w:p>
+            <w:r>
+              <w:rPr>
+                <w:b/>
+              </w:rPr>
+              <w:t>结论</w:t>
+            </w:r>
+          </w:p>
+        </w:tc>
+        <w:tc>
+          <w:tcPr>
+            <w:tcW w:type="dxa" w:w="960"/>
+          </w:tcPr>
+          <w:p>
+            <w:r>
+              <w:rPr>
+                <w:b/>
+              </w:rPr>
+              <w:t>失败原因摘要</w:t>
+            </w:r>
+          </w:p>
+        </w:tc>
+      </w:tr>
+      <w:tr>
+        <w:tc>
+          <w:tcPr>
+            <w:tcW w:type="dxa" w:w="960"/>
+          </w:tcPr>
+          <w:p>
+            <w:r>
+              <w:t>EX-CrossAccount-QueryContent [EXPECT_FAIL]</w:t>
+            </w:r>
+          </w:p>
+        </w:tc>
+        <w:tc>
+          <w:tcPr>
+            <w:tcW w:type="dxa" w:w="960"/>
+          </w:tcPr>
+          <w:p>
+            <w:r>
+              <w:t>异常/边界</w:t>
+            </w:r>
+          </w:p>
+        </w:tc>
+        <w:tc>
+          <w:tcPr>
+            <w:tcW w:type="dxa" w:w="960"/>
+          </w:tcPr>
+          <w:p>
+            <w:r>
+              <w:t>期望失败</w:t>
+            </w:r>
+          </w:p>
+        </w:tc>
+        <w:tc>
+          <w:tcPr>
+            <w:tcW w:type="dxa" w:w="960"/>
+          </w:tcPr>
+          <w:p>
+            <w:r>
+              <w:t>2</w:t>
+            </w:r>
+          </w:p>
+        </w:tc>
+        <w:tc>
+          <w:tcPr>
+            <w:tcW w:type="dxa" w:w="960"/>
+          </w:tcPr>
+          <w:p>
+            <w:r>
+              <w:t>0</w:t>
+            </w:r>
+          </w:p>
+        </w:tc>
+        <w:tc>
+          <w:tcPr>
+            <w:tcW w:type="dxa" w:w="960"/>
+          </w:tcPr>
+          <w:p>
+            <w:r>
+              <w:t>2</w:t>
+            </w:r>
+          </w:p>
+        </w:tc>
+        <w:tc>
+          <w:tcPr>
+            <w:tcW w:type="dxa" w:w="960"/>
+          </w:tcPr>
+          <w:p>
+            <w:r>
+              <w:t>424:2</w:t>
+            </w:r>
+          </w:p>
+        </w:tc>
+        <w:tc>
+          <w:tcPr>
+            <w:tcW w:type="dxa" w:w="960"/>
+          </w:tcPr>
+          <w:p>
+            <w:r>
+              <w:t>FAIL</w:t>
+            </w:r>
+          </w:p>
+        </w:tc>
+        <w:tc>
+          <w:tcPr>
+            <w:tcW w:type="dxa" w:w="960"/>
+          </w:tcPr>
+          <w:p>
+            <w:r>
+              <w:t>Failed Dependency(2)</w:t>
+            </w:r>
+          </w:p>
+        </w:tc>
+      </w:tr>
+      <w:tr>
+        <w:tc>
+          <w:tcPr>
+            <w:tcW w:type="dxa" w:w="960"/>
+          </w:tcPr>
+          <w:p>
+            <w:r>
+              <w:t>EX-CrossAccount-saveExpAnswerRecord [EXPECT_FAIL]</w:t>
+            </w:r>
+          </w:p>
+        </w:tc>
+        <w:tc>
+          <w:tcPr>
+            <w:tcW w:type="dxa" w:w="960"/>
+          </w:tcPr>
+          <w:p>
+            <w:r>
+              <w:t>异常/边界</w:t>
+            </w:r>
+          </w:p>
+        </w:tc>
+        <w:tc>
+          <w:tcPr>
+            <w:tcW w:type="dxa" w:w="960"/>
+          </w:tcPr>
+          <w:p>
+            <w:r>
+              <w:t>期望失败</w:t>
+            </w:r>
+          </w:p>
+        </w:tc>
+        <w:tc>
+          <w:tcPr>
+            <w:tcW w:type="dxa" w:w="960"/>
+          </w:tcPr>
+          <w:p>
+            <w:r>
+              <w:t>2</w:t>
+            </w:r>
+          </w:p>
+        </w:tc>
+        <w:tc>
+          <w:tcPr>
+            <w:tcW w:type="dxa" w:w="960"/>
+          </w:tcPr>
+          <w:p>
+            <w:r>
+              <w:t>0</w:t>
+            </w:r>
+          </w:p>
+        </w:tc>
+        <w:tc>
+          <w:tcPr>
+            <w:tcW w:type="dxa" w:w="960"/>
+          </w:tcPr>
+          <w:p>
+            <w:r>
+              <w:t>2</w:t>
+            </w:r>
+          </w:p>
+        </w:tc>
+        <w:tc>
+          <w:tcPr>
+            <w:tcW w:type="dxa" w:w="960"/>
+          </w:tcPr>
+          <w:p>
+            <w:r>
+              <w:t>424:2</w:t>
+            </w:r>
+          </w:p>
+        </w:tc>
+        <w:tc>
+          <w:tcPr>
+            <w:tcW w:type="dxa" w:w="960"/>
+          </w:tcPr>
+          <w:p>
+            <w:r>
+              <w:t>FAIL</w:t>
+            </w:r>
+          </w:p>
+        </w:tc>
+        <w:tc>
+          <w:tcPr>
+            <w:tcW w:type="dxa" w:w="960"/>
+          </w:tcPr>
+          <w:p>
+            <w:r>
+              <w:t>Failed Dependency(2)</w:t>
+            </w:r>
+          </w:p>
+        </w:tc>
+      </w:tr>
+      <w:tr>
+        <w:tc>
+          <w:tcPr>
+            <w:tcW w:type="dxa" w:w="960"/>
+          </w:tcPr>
+          <w:p>
+            <w:r>
+              <w:t>EX-CrossAccount-saveQuestionAnswer [EXPECT_FAIL]</w:t>
+            </w:r>
+          </w:p>
+        </w:tc>
+        <w:tc>
+          <w:tcPr>
+            <w:tcW w:type="dxa" w:w="960"/>
+          </w:tcPr>
+          <w:p>
+            <w:r>
+              <w:t>异常/边界</w:t>
+            </w:r>
+          </w:p>
+        </w:tc>
+        <w:tc>
+          <w:tcPr>
+            <w:tcW w:type="dxa" w:w="960"/>
+          </w:tcPr>
+          <w:p>
+            <w:r>
+              <w:t>期望失败</w:t>
+            </w:r>
+          </w:p>
+        </w:tc>
+        <w:tc>
+          <w:tcPr>
+            <w:tcW w:type="dxa" w:w="960"/>
+          </w:tcPr>
+          <w:p>
+            <w:r>
+              <w:t>2</w:t>
+            </w:r>
+          </w:p>
+        </w:tc>
+        <w:tc>
+          <w:tcPr>
+            <w:tcW w:type="dxa" w:w="960"/>
+          </w:tcPr>
+          <w:p>
+            <w:r>
+              <w:t>0</w:t>
+            </w:r>
+          </w:p>
+        </w:tc>
+        <w:tc>
+          <w:tcPr>
+            <w:tcW w:type="dxa" w:w="960"/>
+          </w:tcPr>
+          <w:p>
+            <w:r>
+              <w:t>2</w:t>
+            </w:r>
+          </w:p>
+        </w:tc>
+        <w:tc>
+          <w:tcPr>
+            <w:tcW w:type="dxa" w:w="960"/>
+          </w:tcPr>
+          <w:p>
+            <w:r>
+              <w:t>424:2</w:t>
+            </w:r>
+          </w:p>
+        </w:tc>
+        <w:tc>
+          <w:tcPr>
+            <w:tcW w:type="dxa" w:w="960"/>
+          </w:tcPr>
+          <w:p>
+            <w:r>
+              <w:t>FAIL</w:t>
+            </w:r>
+          </w:p>
+        </w:tc>
+        <w:tc>
+          <w:tcPr>
+            <w:tcW w:type="dxa" w:w="960"/>
+          </w:tcPr>
+          <w:p>
+            <w:r>
+              <w:t>Failed Dependency(2)</w:t>
+            </w:r>
+          </w:p>
+        </w:tc>
+      </w:tr>
+      <w:tr>
+        <w:tc>
+          <w:tcPr>
+            <w:tcW w:type="dxa" w:w="960"/>
+          </w:tcPr>
+          <w:p>
+            <w:r>
+              <w:t>EX-EmptyToken-QueryCourseList [EXPECT_FAIL]</w:t>
+            </w:r>
+          </w:p>
+        </w:tc>
+        <w:tc>
+          <w:tcPr>
+            <w:tcW w:type="dxa" w:w="960"/>
+          </w:tcPr>
+          <w:p>
+            <w:r>
+              <w:t>异常/边界</w:t>
+            </w:r>
+          </w:p>
+        </w:tc>
+        <w:tc>
+          <w:tcPr>
+            <w:tcW w:type="dxa" w:w="960"/>
+          </w:tcPr>
+          <w:p>
+            <w:r>
+              <w:t>期望失败</w:t>
+            </w:r>
+          </w:p>
+        </w:tc>
+        <w:tc>
+          <w:tcPr>
+            <w:tcW w:type="dxa" w:w="960"/>
+          </w:tcPr>
+          <w:p>
+            <w:r>
+              <w:t>2</w:t>
+            </w:r>
+          </w:p>
+        </w:tc>
+        <w:tc>
+          <w:tcPr>
+            <w:tcW w:type="dxa" w:w="960"/>
+          </w:tcPr>
+          <w:p>
+            <w:r>
+              <w:t>0</w:t>
+            </w:r>
+          </w:p>
+        </w:tc>
+        <w:tc>
+          <w:tcPr>
+            <w:tcW w:type="dxa" w:w="960"/>
+          </w:tcPr>
+          <w:p>
+            <w:r>
+              <w:t>2</w:t>
+            </w:r>
+          </w:p>
+        </w:tc>
+        <w:tc>
+          <w:tcPr>
+            <w:tcW w:type="dxa" w:w="960"/>
+          </w:tcPr>
+          <w:p>
+            <w:r>
+              <w:t>401:2</w:t>
+            </w:r>
+          </w:p>
+        </w:tc>
+        <w:tc>
+          <w:tcPr>
+            <w:tcW w:type="dxa" w:w="960"/>
+          </w:tcPr>
+          <w:p>
+            <w:r>
+              <w:t>FAIL</w:t>
+            </w:r>
+          </w:p>
+        </w:tc>
+        <w:tc>
+          <w:tcPr>
+            <w:tcW w:type="dxa" w:w="960"/>
+          </w:tcPr>
+          <w:p>
+            <w:r>
+              <w:t>Unauthorized(2)</w:t>
+            </w:r>
+          </w:p>
+        </w:tc>
+      </w:tr>
+      <w:tr>
+        <w:tc>
+          <w:tcPr>
+            <w:tcW w:type="dxa" w:w="960"/>
+          </w:tcPr>
+          <w:p>
+            <w:r>
+              <w:t>EX-FakeToken-QueryCourseList [EXPECT_FAIL]</w:t>
+            </w:r>
+          </w:p>
+        </w:tc>
+        <w:tc>
+          <w:tcPr>
+            <w:tcW w:type="dxa" w:w="960"/>
+          </w:tcPr>
+          <w:p>
+            <w:r>
+              <w:t>异常/边界</w:t>
+            </w:r>
+          </w:p>
+        </w:tc>
+        <w:tc>
+          <w:tcPr>
+            <w:tcW w:type="dxa" w:w="960"/>
+          </w:tcPr>
+          <w:p>
+            <w:r>
+              <w:t>期望失败</w:t>
+            </w:r>
+          </w:p>
+        </w:tc>
+        <w:tc>
+          <w:tcPr>
+            <w:tcW w:type="dxa" w:w="960"/>
+          </w:tcPr>
+          <w:p>
+            <w:r>
+              <w:t>2</w:t>
+            </w:r>
+          </w:p>
+        </w:tc>
+        <w:tc>
+          <w:tcPr>
+            <w:tcW w:type="dxa" w:w="960"/>
+          </w:tcPr>
+          <w:p>
+            <w:r>
+              <w:t>0</w:t>
+            </w:r>
+          </w:p>
+        </w:tc>
+        <w:tc>
+          <w:tcPr>
+            <w:tcW w:type="dxa" w:w="960"/>
+          </w:tcPr>
+          <w:p>
+            <w:r>
+              <w:t>2</w:t>
+            </w:r>
+          </w:p>
+        </w:tc>
+        <w:tc>
+          <w:tcPr>
+            <w:tcW w:type="dxa" w:w="960"/>
+          </w:tcPr>
+          <w:p>
+            <w:r>
+              <w:t>424:2</w:t>
+            </w:r>
+          </w:p>
+        </w:tc>
+        <w:tc>
+          <w:tcPr>
+            <w:tcW w:type="dxa" w:w="960"/>
+          </w:tcPr>
+          <w:p>
+            <w:r>
+              <w:t>FAIL</w:t>
+            </w:r>
+          </w:p>
+        </w:tc>
+        <w:tc>
+          <w:tcPr>
+            <w:tcW w:type="dxa" w:w="960"/>
+          </w:tcPr>
+          <w:p>
+            <w:r>
+              <w:t>Failed Dependency(2)</w:t>
+            </w:r>
+          </w:p>
+        </w:tc>
+      </w:tr>
+      <w:tr>
+        <w:tc>
+          <w:tcPr>
+            <w:tcW w:type="dxa" w:w="960"/>
+          </w:tcPr>
+          <w:p>
+            <w:r>
+              <w:t>EX-HeaderMissing-Logout [EXPECT_FAIL]</w:t>
+            </w:r>
+          </w:p>
+        </w:tc>
+        <w:tc>
+          <w:tcPr>
+            <w:tcW w:type="dxa" w:w="960"/>
+          </w:tcPr>
+          <w:p>
+            <w:r>
+              <w:t>异常/边界</w:t>
+            </w:r>
+          </w:p>
+        </w:tc>
+        <w:tc>
+          <w:tcPr>
+            <w:tcW w:type="dxa" w:w="960"/>
+          </w:tcPr>
+          <w:p>
+            <w:r>
+              <w:t>期望失败</w:t>
+            </w:r>
+          </w:p>
+        </w:tc>
+        <w:tc>
+          <w:tcPr>
+            <w:tcW w:type="dxa" w:w="960"/>
+          </w:tcPr>
+          <w:p>
+            <w:r>
+              <w:t>2</w:t>
+            </w:r>
+          </w:p>
+        </w:tc>
+        <w:tc>
+          <w:tcPr>
+            <w:tcW w:type="dxa" w:w="960"/>
+          </w:tcPr>
+          <w:p>
+            <w:r>
+              <w:t>0</w:t>
+            </w:r>
+          </w:p>
+        </w:tc>
+        <w:tc>
+          <w:tcPr>
+            <w:tcW w:type="dxa" w:w="960"/>
+          </w:tcPr>
+          <w:p>
+            <w:r>
+              <w:t>2</w:t>
+            </w:r>
+          </w:p>
+        </w:tc>
+        <w:tc>
+          <w:tcPr>
+            <w:tcW w:type="dxa" w:w="960"/>
+          </w:tcPr>
+          <w:p>
+            <w:r>
+              <w:t>424:2</w:t>
+            </w:r>
+          </w:p>
+        </w:tc>
+        <w:tc>
+          <w:tcPr>
+            <w:tcW w:type="dxa" w:w="960"/>
+          </w:tcPr>
+          <w:p>
+            <w:r>
+              <w:t>FAIL</w:t>
+            </w:r>
+          </w:p>
+        </w:tc>
+        <w:tc>
+          <w:tcPr>
+            <w:tcW w:type="dxa" w:w="960"/>
+          </w:tcPr>
+          <w:p>
+            <w:r>
+              <w:t>Failed Dependency(2)</w:t>
+            </w:r>
+          </w:p>
+        </w:tc>
+      </w:tr>
+      <w:tr>
+        <w:tc>
+          <w:tcPr>
+            <w:tcW w:type="dxa" w:w="960"/>
+          </w:tcPr>
+          <w:p>
+            <w:r>
+              <w:t>EX-Login baseline [EXPECT_OK]</w:t>
+            </w:r>
+          </w:p>
+        </w:tc>
+        <w:tc>
+          <w:tcPr>
+            <w:tcW w:type="dxa" w:w="960"/>
+          </w:tcPr>
+          <w:p>
+            <w:r>
+              <w:t>异常/边界</w:t>
+            </w:r>
+          </w:p>
+        </w:tc>
+        <w:tc>
+          <w:tcPr>
+            <w:tcW w:type="dxa" w:w="960"/>
+          </w:tcPr>
+          <w:p>
+            <w:r>
+              <w:t>期望成功</w:t>
+            </w:r>
+          </w:p>
+        </w:tc>
+        <w:tc>
+          <w:tcPr>
+            <w:tcW w:type="dxa" w:w="960"/>
+          </w:tcPr>
+          <w:p>
+            <w:r>
+              <w:t>2</w:t>
+            </w:r>
+          </w:p>
+        </w:tc>
+        <w:tc>
+          <w:tcPr>
+            <w:tcW w:type="dxa" w:w="960"/>
+          </w:tcPr>
+          <w:p>
+            <w:r>
+              <w:t>2</w:t>
+            </w:r>
+          </w:p>
+        </w:tc>
+        <w:tc>
+          <w:tcPr>
+            <w:tcW w:type="dxa" w:w="960"/>
+          </w:tcPr>
+          <w:p>
+            <w:r>
+              <w:t>0</w:t>
+            </w:r>
+          </w:p>
+        </w:tc>
+        <w:tc>
+          <w:tcPr>
+            <w:tcW w:type="dxa" w:w="960"/>
+          </w:tcPr>
+          <w:p>
+            <w:r>
+              <w:t>200:2</w:t>
+            </w:r>
+          </w:p>
+        </w:tc>
+        <w:tc>
+          <w:tcPr>
+            <w:tcW w:type="dxa" w:w="960"/>
+          </w:tcPr>
+          <w:p>
+            <w:r>
+              <w:t>PASS</w:t>
+            </w:r>
+          </w:p>
+        </w:tc>
+        <w:tc>
+          <w:tcPr>
+            <w:tcW w:type="dxa" w:w="960"/>
+          </w:tcPr>
+          <w:p>
+            <w:r>
+              <w:t>-</w:t>
+            </w:r>
+          </w:p>
+        </w:tc>
+      </w:tr>
+      <w:tr>
+        <w:tc>
+          <w:tcPr>
+            <w:tcW w:type="dxa" w:w="960"/>
+          </w:tcPr>
+          <w:p>
+            <w:r>
+              <w:t>EX-Logout token [EXPECT_OK]</w:t>
+            </w:r>
+          </w:p>
+        </w:tc>
+        <w:tc>
+          <w:tcPr>
+            <w:tcW w:type="dxa" w:w="960"/>
+          </w:tcPr>
+          <w:p>
+            <w:r>
+              <w:t>异常/边界</w:t>
+            </w:r>
+          </w:p>
+        </w:tc>
+        <w:tc>
+          <w:tcPr>
+            <w:tcW w:type="dxa" w:w="960"/>
+          </w:tcPr>
+          <w:p>
+            <w:r>
+              <w:t>期望成功</w:t>
+            </w:r>
+          </w:p>
+        </w:tc>
+        <w:tc>
+          <w:tcPr>
+            <w:tcW w:type="dxa" w:w="960"/>
+          </w:tcPr>
+          <w:p>
+            <w:r>
+              <w:t>2</w:t>
+            </w:r>
+          </w:p>
+        </w:tc>
+        <w:tc>
+          <w:tcPr>
+            <w:tcW w:type="dxa" w:w="960"/>
+          </w:tcPr>
+          <w:p>
+            <w:r>
+              <w:t>2</w:t>
+            </w:r>
+          </w:p>
+        </w:tc>
+        <w:tc>
+          <w:tcPr>
+            <w:tcW w:type="dxa" w:w="960"/>
+          </w:tcPr>
+          <w:p>
+            <w:r>
+              <w:t>0</w:t>
+            </w:r>
+          </w:p>
+        </w:tc>
+        <w:tc>
+          <w:tcPr>
+            <w:tcW w:type="dxa" w:w="960"/>
+          </w:tcPr>
+          <w:p>
+            <w:r>
+              <w:t>200:2</w:t>
+            </w:r>
+          </w:p>
+        </w:tc>
+        <w:tc>
+          <w:tcPr>
+            <w:tcW w:type="dxa" w:w="960"/>
+          </w:tcPr>
+          <w:p>
+            <w:r>
+              <w:t>PASS</w:t>
+            </w:r>
+          </w:p>
+        </w:tc>
+        <w:tc>
+          <w:tcPr>
+            <w:tcW w:type="dxa" w:w="960"/>
+          </w:tcPr>
+          <w:p>
+            <w:r>
+              <w:t>-</w:t>
+            </w:r>
+          </w:p>
+        </w:tc>
+      </w:tr>
+      <w:tr>
+        <w:tc>
+          <w:tcPr>
+            <w:tcW w:type="dxa" w:w="960"/>
+          </w:tcPr>
+          <w:p>
+            <w:r>
+              <w:t>EX-NoAuth-QueryCourseList [EXPECT_FAIL]</w:t>
+            </w:r>
+          </w:p>
+        </w:tc>
+        <w:tc>
+          <w:tcPr>
+            <w:tcW w:type="dxa" w:w="960"/>
+          </w:tcPr>
+          <w:p>
+            <w:r>
+              <w:t>异常/边界</w:t>
+            </w:r>
+          </w:p>
+        </w:tc>
+        <w:tc>
+          <w:tcPr>
+            <w:tcW w:type="dxa" w:w="960"/>
+          </w:tcPr>
+          <w:p>
+            <w:r>
+              <w:t>期望失败</w:t>
+            </w:r>
+          </w:p>
+        </w:tc>
+        <w:tc>
+          <w:tcPr>
+            <w:tcW w:type="dxa" w:w="960"/>
+          </w:tcPr>
+          <w:p>
+            <w:r>
+              <w:t>2</w:t>
+            </w:r>
+          </w:p>
+        </w:tc>
+        <w:tc>
+          <w:tcPr>
+            <w:tcW w:type="dxa" w:w="960"/>
+          </w:tcPr>
+          <w:p>
+            <w:r>
+              <w:t>0</w:t>
+            </w:r>
+          </w:p>
+        </w:tc>
+        <w:tc>
+          <w:tcPr>
+            <w:tcW w:type="dxa" w:w="960"/>
+          </w:tcPr>
+          <w:p>
+            <w:r>
+              <w:t>2</w:t>
+            </w:r>
+          </w:p>
+        </w:tc>
+        <w:tc>
+          <w:tcPr>
+            <w:tcW w:type="dxa" w:w="960"/>
+          </w:tcPr>
+          <w:p>
+            <w:r>
+              <w:t>500:2</w:t>
+            </w:r>
+          </w:p>
+        </w:tc>
+        <w:tc>
+          <w:tcPr>
+            <w:tcW w:type="dxa" w:w="960"/>
+          </w:tcPr>
+          <w:p>
+            <w:r>
+              <w:t>FAIL</w:t>
+            </w:r>
+          </w:p>
+        </w:tc>
+        <w:tc>
+          <w:tcPr>
+            <w:tcW w:type="dxa" w:w="960"/>
+          </w:tcPr>
+          <w:p>
+            <w:r>
+              <w:t>Server exception signature detected in exception scenario: EX-NoAuth-QueryCourseList [EXPECT_FAIL](2)</w:t>
+            </w:r>
+          </w:p>
+        </w:tc>
+      </w:tr>
+      <w:tr>
+        <w:tc>
+          <w:tcPr>
+            <w:tcW w:type="dxa" w:w="960"/>
+          </w:tcPr>
+          <w:p>
+            <w:r>
+              <w:t>EX-ReuseToken-AfterLogout [EXPECT_FAIL]</w:t>
+            </w:r>
+          </w:p>
+        </w:tc>
+        <w:tc>
+          <w:tcPr>
+            <w:tcW w:type="dxa" w:w="960"/>
+          </w:tcPr>
+          <w:p>
+            <w:r>
+              <w:t>异常/边界</w:t>
+            </w:r>
+          </w:p>
+        </w:tc>
+        <w:tc>
+          <w:tcPr>
+            <w:tcW w:type="dxa" w:w="960"/>
+          </w:tcPr>
+          <w:p>
+            <w:r>
+              <w:t>期望失败</w:t>
+            </w:r>
+          </w:p>
+        </w:tc>
+        <w:tc>
+          <w:tcPr>
+            <w:tcW w:type="dxa" w:w="960"/>
+          </w:tcPr>
+          <w:p>
+            <w:r>
+              <w:t>2</w:t>
+            </w:r>
+          </w:p>
+        </w:tc>
+        <w:tc>
+          <w:tcPr>
+            <w:tcW w:type="dxa" w:w="960"/>
+          </w:tcPr>
+          <w:p>
+            <w:r>
+              <w:t>0</w:t>
+            </w:r>
+          </w:p>
+        </w:tc>
+        <w:tc>
+          <w:tcPr>
+            <w:tcW w:type="dxa" w:w="960"/>
+          </w:tcPr>
+          <w:p>
+            <w:r>
+              <w:t>2</w:t>
+            </w:r>
+          </w:p>
+        </w:tc>
+        <w:tc>
+          <w:tcPr>
+            <w:tcW w:type="dxa" w:w="960"/>
+          </w:tcPr>
+          <w:p>
+            <w:r>
+              <w:t>424:2</w:t>
+            </w:r>
+          </w:p>
+        </w:tc>
+        <w:tc>
+          <w:tcPr>
+            <w:tcW w:type="dxa" w:w="960"/>
+          </w:tcPr>
+          <w:p>
+            <w:r>
+              <w:t>FAIL</w:t>
+            </w:r>
+          </w:p>
+        </w:tc>
+        <w:tc>
+          <w:tcPr>
+            <w:tcW w:type="dxa" w:w="960"/>
+          </w:tcPr>
+          <w:p>
+            <w:r>
+              <w:t>Failed Dependency(2)</w:t>
+            </w:r>
+          </w:p>
+        </w:tc>
+      </w:tr>
+      <w:tr>
+        <w:tc>
+          <w:tcPr>
+            <w:tcW w:type="dxa" w:w="960"/>
+          </w:tcPr>
+          <w:p>
+            <w:r>
+              <w:t>EX-blockId-empty [EXPECT_FAIL]</w:t>
+            </w:r>
+          </w:p>
+        </w:tc>
+        <w:tc>
+          <w:tcPr>
+            <w:tcW w:type="dxa" w:w="960"/>
+          </w:tcPr>
+          <w:p>
+            <w:r>
+              <w:t>异常/边界</w:t>
+            </w:r>
+          </w:p>
+        </w:tc>
+        <w:tc>
+          <w:tcPr>
+            <w:tcW w:type="dxa" w:w="960"/>
+          </w:tcPr>
+          <w:p>
+            <w:r>
+              <w:t>期望失败</w:t>
+            </w:r>
+          </w:p>
+        </w:tc>
+        <w:tc>
+          <w:tcPr>
+            <w:tcW w:type="dxa" w:w="960"/>
+          </w:tcPr>
+          <w:p>
+            <w:r>
+              <w:t>2</w:t>
+            </w:r>
+          </w:p>
+        </w:tc>
+        <w:tc>
+          <w:tcPr>
+            <w:tcW w:type="dxa" w:w="960"/>
+          </w:tcPr>
+          <w:p>
+            <w:r>
+              <w:t>0</w:t>
+            </w:r>
+          </w:p>
+        </w:tc>
+        <w:tc>
+          <w:tcPr>
+            <w:tcW w:type="dxa" w:w="960"/>
+          </w:tcPr>
+          <w:p>
+            <w:r>
+              <w:t>2</w:t>
+            </w:r>
+          </w:p>
+        </w:tc>
+        <w:tc>
+          <w:tcPr>
+            <w:tcW w:type="dxa" w:w="960"/>
+          </w:tcPr>
+          <w:p>
+            <w:r>
+              <w:t>424:2</w:t>
+            </w:r>
+          </w:p>
+        </w:tc>
+        <w:tc>
+          <w:tcPr>
+            <w:tcW w:type="dxa" w:w="960"/>
+          </w:tcPr>
+          <w:p>
+            <w:r>
+              <w:t>FAIL</w:t>
+            </w:r>
+          </w:p>
+        </w:tc>
+        <w:tc>
+          <w:tcPr>
+            <w:tcW w:type="dxa" w:w="960"/>
+          </w:tcPr>
+          <w:p>
+            <w:r>
+              <w:t>Failed Dependency(2)</w:t>
+            </w:r>
+          </w:p>
+        </w:tc>
+      </w:tr>
+      <w:tr>
+        <w:tc>
+          <w:tcPr>
+            <w:tcW w:type="dxa" w:w="960"/>
+          </w:tcPr>
+          <w:p>
+            <w:r>
+              <w:t>EX-clientKey-compatible [EXPECT_OK]</w:t>
+            </w:r>
+          </w:p>
+        </w:tc>
+        <w:tc>
+          <w:tcPr>
+            <w:tcW w:type="dxa" w:w="960"/>
+          </w:tcPr>
+          <w:p>
+            <w:r>
+              <w:t>异常/边界</w:t>
+            </w:r>
+          </w:p>
+        </w:tc>
+        <w:tc>
+          <w:tcPr>
+            <w:tcW w:type="dxa" w:w="960"/>
+          </w:tcPr>
+          <w:p>
+            <w:r>
+              <w:t>期望成功</w:t>
+            </w:r>
+          </w:p>
+        </w:tc>
+        <w:tc>
+          <w:tcPr>
+            <w:tcW w:type="dxa" w:w="960"/>
+          </w:tcPr>
+          <w:p>
+            <w:r>
+              <w:t>2</w:t>
+            </w:r>
+          </w:p>
+        </w:tc>
+        <w:tc>
+          <w:tcPr>
+            <w:tcW w:type="dxa" w:w="960"/>
+          </w:tcPr>
+          <w:p>
+            <w:r>
+              <w:t>0</w:t>
+            </w:r>
+          </w:p>
+        </w:tc>
+        <w:tc>
+          <w:tcPr>
+            <w:tcW w:type="dxa" w:w="960"/>
+          </w:tcPr>
+          <w:p>
+            <w:r>
+              <w:t>2</w:t>
+            </w:r>
+          </w:p>
+        </w:tc>
+        <w:tc>
+          <w:tcPr>
+            <w:tcW w:type="dxa" w:w="960"/>
+          </w:tcPr>
+          <w:p>
+            <w:r>
+              <w:t>424:2</w:t>
+            </w:r>
+          </w:p>
+        </w:tc>
+        <w:tc>
+          <w:tcPr>
+            <w:tcW w:type="dxa" w:w="960"/>
+          </w:tcPr>
+          <w:p>
+            <w:r>
+              <w:t>FAIL</w:t>
+            </w:r>
+          </w:p>
+        </w:tc>
+        <w:tc>
+          <w:tcPr>
+            <w:tcW w:type="dxa" w:w="960"/>
+          </w:tcPr>
+          <w:p>
+            <w:r>
+              <w:t>Expected success but got business failure: EX-clientKey-compatible [EXPECT_OK] code=1(2)</w:t>
+            </w:r>
+          </w:p>
+        </w:tc>
+      </w:tr>
+      <w:tr>
+        <w:tc>
+          <w:tcPr>
+            <w:tcW w:type="dxa" w:w="960"/>
+          </w:tcPr>
+          <w:p>
+            <w:r>
+              <w:t>EX-clientVersion-1.0.0 [EXPECT_OK]</w:t>
+            </w:r>
+          </w:p>
+        </w:tc>
+        <w:tc>
+          <w:tcPr>
+            <w:tcW w:type="dxa" w:w="960"/>
+          </w:tcPr>
+          <w:p>
+            <w:r>
+              <w:t>异常/边界</w:t>
+            </w:r>
+          </w:p>
+        </w:tc>
+        <w:tc>
+          <w:tcPr>
+            <w:tcW w:type="dxa" w:w="960"/>
+          </w:tcPr>
+          <w:p>
+            <w:r>
+              <w:t>期望成功</w:t>
+            </w:r>
+          </w:p>
+        </w:tc>
+        <w:tc>
+          <w:tcPr>
+            <w:tcW w:type="dxa" w:w="960"/>
+          </w:tcPr>
+          <w:p>
+            <w:r>
+              <w:t>2</w:t>
+            </w:r>
+          </w:p>
+        </w:tc>
+        <w:tc>
+          <w:tcPr>
+            <w:tcW w:type="dxa" w:w="960"/>
+          </w:tcPr>
+          <w:p>
+            <w:r>
+              <w:t>0</w:t>
+            </w:r>
+          </w:p>
+        </w:tc>
+        <w:tc>
+          <w:tcPr>
+            <w:tcW w:type="dxa" w:w="960"/>
+          </w:tcPr>
+          <w:p>
+            <w:r>
+              <w:t>2</w:t>
+            </w:r>
+          </w:p>
+        </w:tc>
+        <w:tc>
+          <w:tcPr>
+            <w:tcW w:type="dxa" w:w="960"/>
+          </w:tcPr>
+          <w:p>
+            <w:r>
+              <w:t>424:2</w:t>
+            </w:r>
+          </w:p>
+        </w:tc>
+        <w:tc>
+          <w:tcPr>
+            <w:tcW w:type="dxa" w:w="960"/>
+          </w:tcPr>
+          <w:p>
+            <w:r>
+              <w:t>FAIL</w:t>
+            </w:r>
+          </w:p>
+        </w:tc>
+        <w:tc>
+          <w:tcPr>
+            <w:tcW w:type="dxa" w:w="960"/>
+          </w:tcPr>
+          <w:p>
+            <w:r>
+              <w:t>Expected success but got business failure: EX-clientVersion-1.0.0 [EXPECT_OK] code=1(2)</w:t>
+            </w:r>
+          </w:p>
+        </w:tc>
+      </w:tr>
+      <w:tr>
+        <w:tc>
+          <w:tcPr>
+            <w:tcW w:type="dxa" w:w="960"/>
+          </w:tcPr>
+          <w:p>
+            <w:r>
+              <w:t>EX-clientVersion-V1.0 [EXPECT_OK]</w:t>
+            </w:r>
+          </w:p>
+        </w:tc>
+        <w:tc>
+          <w:tcPr>
+            <w:tcW w:type="dxa" w:w="960"/>
+          </w:tcPr>
+          <w:p>
+            <w:r>
+              <w:t>异常/边界</w:t>
+            </w:r>
+          </w:p>
+        </w:tc>
+        <w:tc>
+          <w:tcPr>
+            <w:tcW w:type="dxa" w:w="960"/>
+          </w:tcPr>
+          <w:p>
+            <w:r>
+              <w:t>期望成功</w:t>
+            </w:r>
+          </w:p>
+        </w:tc>
+        <w:tc>
+          <w:tcPr>
+            <w:tcW w:type="dxa" w:w="960"/>
+          </w:tcPr>
+          <w:p>
+            <w:r>
+              <w:t>2</w:t>
+            </w:r>
+          </w:p>
+        </w:tc>
+        <w:tc>
+          <w:tcPr>
+            <w:tcW w:type="dxa" w:w="960"/>
+          </w:tcPr>
+          <w:p>
+            <w:r>
+              <w:t>0</w:t>
+            </w:r>
+          </w:p>
+        </w:tc>
+        <w:tc>
+          <w:tcPr>
+            <w:tcW w:type="dxa" w:w="960"/>
+          </w:tcPr>
+          <w:p>
+            <w:r>
+              <w:t>2</w:t>
+            </w:r>
+          </w:p>
+        </w:tc>
+        <w:tc>
+          <w:tcPr>
+            <w:tcW w:type="dxa" w:w="960"/>
+          </w:tcPr>
+          <w:p>
+            <w:r>
+              <w:t>424:2</w:t>
+            </w:r>
+          </w:p>
+        </w:tc>
+        <w:tc>
+          <w:tcPr>
+            <w:tcW w:type="dxa" w:w="960"/>
+          </w:tcPr>
+          <w:p>
+            <w:r>
+              <w:t>FAIL</w:t>
+            </w:r>
+          </w:p>
+        </w:tc>
+        <w:tc>
+          <w:tcPr>
+            <w:tcW w:type="dxa" w:w="960"/>
+          </w:tcPr>
+          <w:p>
+            <w:r>
+              <w:t>Expected success but got business failure: EX-clientVersion-V1.0 [EXPECT_OK] code=1(2)</w:t>
+            </w:r>
+          </w:p>
+        </w:tc>
+      </w:tr>
+      <w:tr>
+        <w:tc>
+          <w:tcPr>
+            <w:tcW w:type="dxa" w:w="960"/>
+          </w:tcPr>
+          <w:p>
+            <w:r>
+              <w:t>EX-clientVersion-v1.0 [EXPECT_OK]</w:t>
+            </w:r>
+          </w:p>
+        </w:tc>
+        <w:tc>
+          <w:tcPr>
+            <w:tcW w:type="dxa" w:w="960"/>
+          </w:tcPr>
+          <w:p>
+            <w:r>
+              <w:t>异常/边界</w:t>
+            </w:r>
+          </w:p>
+        </w:tc>
+        <w:tc>
+          <w:tcPr>
+            <w:tcW w:type="dxa" w:w="960"/>
+          </w:tcPr>
+          <w:p>
+            <w:r>
+              <w:t>期望成功</w:t>
+            </w:r>
+          </w:p>
+        </w:tc>
+        <w:tc>
+          <w:tcPr>
+            <w:tcW w:type="dxa" w:w="960"/>
+          </w:tcPr>
+          <w:p>
+            <w:r>
+              <w:t>2</w:t>
+            </w:r>
+          </w:p>
+        </w:tc>
+        <w:tc>
+          <w:tcPr>
+            <w:tcW w:type="dxa" w:w="960"/>
+          </w:tcPr>
+          <w:p>
+            <w:r>
+              <w:t>0</w:t>
+            </w:r>
+          </w:p>
+        </w:tc>
+        <w:tc>
+          <w:tcPr>
+            <w:tcW w:type="dxa" w:w="960"/>
+          </w:tcPr>
+          <w:p>
+            <w:r>
+              <w:t>2</w:t>
+            </w:r>
+          </w:p>
+        </w:tc>
+        <w:tc>
+          <w:tcPr>
+            <w:tcW w:type="dxa" w:w="960"/>
+          </w:tcPr>
+          <w:p>
+            <w:r>
+              <w:t>424:2</w:t>
+            </w:r>
+          </w:p>
+        </w:tc>
+        <w:tc>
+          <w:tcPr>
+            <w:tcW w:type="dxa" w:w="960"/>
+          </w:tcPr>
+          <w:p>
+            <w:r>
+              <w:t>FAIL</w:t>
+            </w:r>
+          </w:p>
+        </w:tc>
+        <w:tc>
+          <w:tcPr>
+            <w:tcW w:type="dxa" w:w="960"/>
+          </w:tcPr>
+          <w:p>
+            <w:r>
+              <w:t>Expected success but got business failure: EX-clientVersion-v1.0 [EXPECT_OK] code=1(2)</w:t>
+            </w:r>
+          </w:p>
+        </w:tc>
+      </w:tr>
+      <w:tr>
+        <w:tc>
+          <w:tcPr>
+            <w:tcW w:type="dxa" w:w="960"/>
+          </w:tcPr>
+          <w:p>
+            <w:r>
+              <w:t>EX-clientkey-compatible [EXPECT_OK]</w:t>
+            </w:r>
+          </w:p>
+        </w:tc>
+        <w:tc>
+          <w:tcPr>
+            <w:tcW w:type="dxa" w:w="960"/>
+          </w:tcPr>
+          <w:p>
+            <w:r>
+              <w:t>异常/边界</w:t>
+            </w:r>
+          </w:p>
+        </w:tc>
+        <w:tc>
+          <w:tcPr>
+            <w:tcW w:type="dxa" w:w="960"/>
+          </w:tcPr>
+          <w:p>
+            <w:r>
+              <w:t>期望成功</w:t>
+            </w:r>
+          </w:p>
+        </w:tc>
+        <w:tc>
+          <w:tcPr>
+            <w:tcW w:type="dxa" w:w="960"/>
+          </w:tcPr>
+          <w:p>
+            <w:r>
+              <w:t>2</w:t>
+            </w:r>
+          </w:p>
+        </w:tc>
+        <w:tc>
+          <w:tcPr>
+            <w:tcW w:type="dxa" w:w="960"/>
+          </w:tcPr>
+          <w:p>
+            <w:r>
+              <w:t>0</w:t>
+            </w:r>
+          </w:p>
+        </w:tc>
+        <w:tc>
+          <w:tcPr>
+            <w:tcW w:type="dxa" w:w="960"/>
+          </w:tcPr>
+          <w:p>
+            <w:r>
+              <w:t>2</w:t>
+            </w:r>
+          </w:p>
+        </w:tc>
+        <w:tc>
+          <w:tcPr>
+            <w:tcW w:type="dxa" w:w="960"/>
+          </w:tcPr>
+          <w:p>
+            <w:r>
+              <w:t>424:2</w:t>
+            </w:r>
+          </w:p>
+        </w:tc>
+        <w:tc>
+          <w:tcPr>
+            <w:tcW w:type="dxa" w:w="960"/>
+          </w:tcPr>
+          <w:p>
+            <w:r>
+              <w:t>FAIL</w:t>
+            </w:r>
+          </w:p>
+        </w:tc>
+        <w:tc>
+          <w:tcPr>
+            <w:tcW w:type="dxa" w:w="960"/>
+          </w:tcPr>
+          <w:p>
+            <w:r>
+              <w:t>Expected success but got business failure: EX-clientkey-compatible [EXPECT_OK] code=1(2)</w:t>
+            </w:r>
+          </w:p>
+        </w:tc>
+      </w:tr>
+      <w:tr>
+        <w:tc>
+          <w:tcPr>
+            <w:tcW w:type="dxa" w:w="960"/>
+          </w:tcPr>
+          <w:p>
+            <w:r>
+              <w:t>EX-courseId-empty [EXPECT_FAIL]</w:t>
+            </w:r>
+          </w:p>
+        </w:tc>
+        <w:tc>
+          <w:tcPr>
+            <w:tcW w:type="dxa" w:w="960"/>
+          </w:tcPr>
+          <w:p>
+            <w:r>
+              <w:t>异常/边界</w:t>
+            </w:r>
+          </w:p>
+        </w:tc>
+        <w:tc>
+          <w:tcPr>
+            <w:tcW w:type="dxa" w:w="960"/>
+          </w:tcPr>
+          <w:p>
+            <w:r>
+              <w:t>期望失败</w:t>
+            </w:r>
+          </w:p>
+        </w:tc>
+        <w:tc>
+          <w:tcPr>
+            <w:tcW w:type="dxa" w:w="960"/>
+          </w:tcPr>
+          <w:p>
+            <w:r>
+              <w:t>2</w:t>
+            </w:r>
+          </w:p>
+        </w:tc>
+        <w:tc>
+          <w:tcPr>
+            <w:tcW w:type="dxa" w:w="960"/>
+          </w:tcPr>
+          <w:p>
+            <w:r>
+              <w:t>0</w:t>
+            </w:r>
+          </w:p>
+        </w:tc>
+        <w:tc>
+          <w:tcPr>
+            <w:tcW w:type="dxa" w:w="960"/>
+          </w:tcPr>
+          <w:p>
+            <w:r>
+              <w:t>2</w:t>
+            </w:r>
+          </w:p>
+        </w:tc>
+        <w:tc>
+          <w:tcPr>
+            <w:tcW w:type="dxa" w:w="960"/>
+          </w:tcPr>
+          <w:p>
+            <w:r>
+              <w:t>424:2</w:t>
+            </w:r>
+          </w:p>
+        </w:tc>
+        <w:tc>
+          <w:tcPr>
+            <w:tcW w:type="dxa" w:w="960"/>
+          </w:tcPr>
+          <w:p>
+            <w:r>
+              <w:t>FAIL</w:t>
+            </w:r>
+          </w:p>
+        </w:tc>
+        <w:tc>
+          <w:tcPr>
+            <w:tcW w:type="dxa" w:w="960"/>
+          </w:tcPr>
+          <w:p>
+            <w:r>
+              <w:t>Failed Dependency(2)</w:t>
+            </w:r>
+          </w:p>
+        </w:tc>
+      </w:tr>
+      <w:tr>
+        <w:tc>
+          <w:tcPr>
+            <w:tcW w:type="dxa" w:w="960"/>
+          </w:tcPr>
+          <w:p>
+            <w:r>
+              <w:t>EX-courseId-illegal [EXPECT_FAIL]</w:t>
+            </w:r>
+          </w:p>
+        </w:tc>
+        <w:tc>
+          <w:tcPr>
+            <w:tcW w:type="dxa" w:w="960"/>
+          </w:tcPr>
+          <w:p>
+            <w:r>
+              <w:t>异常/边界</w:t>
+            </w:r>
+          </w:p>
+        </w:tc>
+        <w:tc>
+          <w:tcPr>
+            <w:tcW w:type="dxa" w:w="960"/>
+          </w:tcPr>
+          <w:p>
+            <w:r>
+              <w:t>期望失败</w:t>
+            </w:r>
+          </w:p>
+        </w:tc>
+        <w:tc>
+          <w:tcPr>
+            <w:tcW w:type="dxa" w:w="960"/>
+          </w:tcPr>
+          <w:p>
+            <w:r>
+              <w:t>2</w:t>
+            </w:r>
+          </w:p>
+        </w:tc>
+        <w:tc>
+          <w:tcPr>
+            <w:tcW w:type="dxa" w:w="960"/>
+          </w:tcPr>
+          <w:p>
+            <w:r>
+              <w:t>0</w:t>
+            </w:r>
+          </w:p>
+        </w:tc>
+        <w:tc>
+          <w:tcPr>
+            <w:tcW w:type="dxa" w:w="960"/>
+          </w:tcPr>
+          <w:p>
+            <w:r>
+              <w:t>2</w:t>
+            </w:r>
+          </w:p>
+        </w:tc>
+        <w:tc>
+          <w:tcPr>
+            <w:tcW w:type="dxa" w:w="960"/>
+          </w:tcPr>
+          <w:p>
+            <w:r>
+              <w:t>424:2</w:t>
+            </w:r>
+          </w:p>
+        </w:tc>
+        <w:tc>
+          <w:tcPr>
+            <w:tcW w:type="dxa" w:w="960"/>
+          </w:tcPr>
+          <w:p>
+            <w:r>
+              <w:t>FAIL</w:t>
+            </w:r>
+          </w:p>
+        </w:tc>
+        <w:tc>
+          <w:tcPr>
+            <w:tcW w:type="dxa" w:w="960"/>
+          </w:tcPr>
+          <w:p>
+            <w:r>
+              <w:t>Failed Dependency(2)</w:t>
+            </w:r>
+          </w:p>
+        </w:tc>
+      </w:tr>
+      <w:tr>
+        <w:tc>
+          <w:tcPr>
+            <w:tcW w:type="dxa" w:w="960"/>
+          </w:tcPr>
+          <w:p>
+            <w:r>
+              <w:t>EX-teachingTaskId-empty [EXPECT_FAIL]</w:t>
+            </w:r>
+          </w:p>
+        </w:tc>
+        <w:tc>
+          <w:tcPr>
+            <w:tcW w:type="dxa" w:w="960"/>
+          </w:tcPr>
+          <w:p>
+            <w:r>
+              <w:t>异常/边界</w:t>
+            </w:r>
+          </w:p>
+        </w:tc>
+        <w:tc>
+          <w:tcPr>
+            <w:tcW w:type="dxa" w:w="960"/>
+          </w:tcPr>
+          <w:p>
+            <w:r>
+              <w:t>期望失败</w:t>
+            </w:r>
+          </w:p>
+        </w:tc>
+        <w:tc>
+          <w:tcPr>
+            <w:tcW w:type="dxa" w:w="960"/>
+          </w:tcPr>
+          <w:p>
+            <w:r>
+              <w:t>2</w:t>
+            </w:r>
+          </w:p>
+        </w:tc>
+        <w:tc>
+          <w:tcPr>
+            <w:tcW w:type="dxa" w:w="960"/>
+          </w:tcPr>
+          <w:p>
+            <w:r>
+              <w:t>0</w:t>
+            </w:r>
+          </w:p>
+        </w:tc>
+        <w:tc>
+          <w:tcPr>
+            <w:tcW w:type="dxa" w:w="960"/>
+          </w:tcPr>
+          <w:p>
+            <w:r>
+              <w:t>2</w:t>
+            </w:r>
+          </w:p>
+        </w:tc>
+        <w:tc>
+          <w:tcPr>
+            <w:tcW w:type="dxa" w:w="960"/>
+          </w:tcPr>
+          <w:p>
+            <w:r>
+              <w:t>424:2</w:t>
+            </w:r>
+          </w:p>
+        </w:tc>
+        <w:tc>
+          <w:tcPr>
+            <w:tcW w:type="dxa" w:w="960"/>
+          </w:tcPr>
+          <w:p>
+            <w:r>
+              <w:t>FAIL</w:t>
+            </w:r>
+          </w:p>
+        </w:tc>
+        <w:tc>
+          <w:tcPr>
+            <w:tcW w:type="dxa" w:w="960"/>
+          </w:tcPr>
+          <w:p>
+            <w:r>
+              <w:t>Failed Dependency(2)</w:t>
+            </w:r>
+          </w:p>
+        </w:tc>
+      </w:tr>
+      <w:tr>
+        <w:tc>
+          <w:tcPr>
+            <w:tcW w:type="dxa" w:w="960"/>
+          </w:tcPr>
+          <w:p>
+            <w:r>
+              <w:t>EX-teachingTaskId-illegal [EXPECT_FAIL]</w:t>
+            </w:r>
+          </w:p>
+        </w:tc>
+        <w:tc>
+          <w:tcPr>
+            <w:tcW w:type="dxa" w:w="960"/>
+          </w:tcPr>
+          <w:p>
+            <w:r>
+              <w:t>异常/边界</w:t>
+            </w:r>
+          </w:p>
+        </w:tc>
+        <w:tc>
+          <w:tcPr>
+            <w:tcW w:type="dxa" w:w="960"/>
+          </w:tcPr>
+          <w:p>
+            <w:r>
+              <w:t>期望失败</w:t>
+            </w:r>
+          </w:p>
+        </w:tc>
+        <w:tc>
+          <w:tcPr>
+            <w:tcW w:type="dxa" w:w="960"/>
+          </w:tcPr>
+          <w:p>
+            <w:r>
+              <w:t>2</w:t>
+            </w:r>
+          </w:p>
+        </w:tc>
+        <w:tc>
+          <w:tcPr>
+            <w:tcW w:type="dxa" w:w="960"/>
+          </w:tcPr>
+          <w:p>
+            <w:r>
+              <w:t>0</w:t>
+            </w:r>
+          </w:p>
+        </w:tc>
+        <w:tc>
+          <w:tcPr>
+            <w:tcW w:type="dxa" w:w="960"/>
+          </w:tcPr>
+          <w:p>
+            <w:r>
+              <w:t>2</w:t>
+            </w:r>
+          </w:p>
+        </w:tc>
+        <w:tc>
+          <w:tcPr>
+            <w:tcW w:type="dxa" w:w="960"/>
+          </w:tcPr>
+          <w:p>
+            <w:r>
+              <w:t>424:2</w:t>
+            </w:r>
+          </w:p>
+        </w:tc>
+        <w:tc>
+          <w:tcPr>
+            <w:tcW w:type="dxa" w:w="960"/>
+          </w:tcPr>
+          <w:p>
+            <w:r>
+              <w:t>FAIL</w:t>
+            </w:r>
+          </w:p>
+        </w:tc>
+        <w:tc>
+          <w:tcPr>
+            <w:tcW w:type="dxa" w:w="960"/>
+          </w:tcPr>
+          <w:p>
+            <w:r>
+              <w:t>Failed Dependency(2)</w:t>
+            </w:r>
+          </w:p>
+        </w:tc>
+      </w:tr>
+      <w:tr>
+        <w:tc>
+          <w:tcPr>
+            <w:tcW w:type="dxa" w:w="960"/>
+          </w:tcPr>
+          <w:p>
+            <w:r>
+              <w:t>EX-userReportId-empty [EXPECT_FAIL]</w:t>
+            </w:r>
+          </w:p>
+        </w:tc>
+        <w:tc>
+          <w:tcPr>
+            <w:tcW w:type="dxa" w:w="960"/>
+          </w:tcPr>
+          <w:p>
+            <w:r>
+              <w:t>异常/边界</w:t>
+            </w:r>
+          </w:p>
+        </w:tc>
+        <w:tc>
+          <w:tcPr>
+            <w:tcW w:type="dxa" w:w="960"/>
+          </w:tcPr>
+          <w:p>
+            <w:r>
+              <w:t>期望失败</w:t>
+            </w:r>
+          </w:p>
+        </w:tc>
+        <w:tc>
+          <w:tcPr>
+            <w:tcW w:type="dxa" w:w="960"/>
+          </w:tcPr>
+          <w:p>
+            <w:r>
+              <w:t>2</w:t>
+            </w:r>
+          </w:p>
+        </w:tc>
+        <w:tc>
+          <w:tcPr>
+            <w:tcW w:type="dxa" w:w="960"/>
+          </w:tcPr>
+          <w:p>
+            <w:r>
+              <w:t>0</w:t>
+            </w:r>
+          </w:p>
+        </w:tc>
+        <w:tc>
+          <w:tcPr>
+            <w:tcW w:type="dxa" w:w="960"/>
+          </w:tcPr>
+          <w:p>
+            <w:r>
+              <w:t>2</w:t>
+            </w:r>
+          </w:p>
+        </w:tc>
+        <w:tc>
+          <w:tcPr>
+            <w:tcW w:type="dxa" w:w="960"/>
+          </w:tcPr>
+          <w:p>
+            <w:r>
+              <w:t>424:2</w:t>
+            </w:r>
+          </w:p>
+        </w:tc>
+        <w:tc>
+          <w:tcPr>
+            <w:tcW w:type="dxa" w:w="960"/>
+          </w:tcPr>
+          <w:p>
+            <w:r>
+              <w:t>FAIL</w:t>
+            </w:r>
+          </w:p>
+        </w:tc>
+        <w:tc>
+          <w:tcPr>
+            <w:tcW w:type="dxa" w:w="960"/>
+          </w:tcPr>
+          <w:p>
+            <w:r>
+              <w:t>Failed Dependency(2)</w:t>
+            </w:r>
+          </w:p>
+        </w:tc>
+      </w:tr>
+      <w:tr>
+        <w:tc>
+          <w:tcPr>
+            <w:tcW w:type="dxa" w:w="960"/>
+          </w:tcPr>
+          <w:p>
+            <w:r>
+              <w:t>FUNC-GetCourseChapterTaskList</w:t>
+            </w:r>
+          </w:p>
+        </w:tc>
+        <w:tc>
+          <w:tcPr>
+            <w:tcW w:type="dxa" w:w="960"/>
+          </w:tcPr>
+          <w:p>
+            <w:r>
+              <w:t>正向主链路</w:t>
+            </w:r>
+          </w:p>
+        </w:tc>
+        <w:tc>
+          <w:tcPr>
+            <w:tcW w:type="dxa" w:w="960"/>
+          </w:tcPr>
+          <w:p>
+            <w:r>
+              <w:t>期望成功</w:t>
+            </w:r>
+          </w:p>
+        </w:tc>
+        <w:tc>
+          <w:tcPr>
+            <w:tcW w:type="dxa" w:w="960"/>
+          </w:tcPr>
+          <w:p>
+            <w:r>
+              <w:t>8</w:t>
+            </w:r>
+          </w:p>
+        </w:tc>
+        <w:tc>
+          <w:tcPr>
+            <w:tcW w:type="dxa" w:w="960"/>
+          </w:tcPr>
+          <w:p>
+            <w:r>
+              <w:t>6</w:t>
+            </w:r>
+          </w:p>
+        </w:tc>
+        <w:tc>
+          <w:tcPr>
+            <w:tcW w:type="dxa" w:w="960"/>
+          </w:tcPr>
+          <w:p>
+            <w:r>
+              <w:t>2</w:t>
+            </w:r>
+          </w:p>
+        </w:tc>
+        <w:tc>
+          <w:tcPr>
+            <w:tcW w:type="dxa" w:w="960"/>
+          </w:tcPr>
+          <w:p>
+            <w:r>
+              <w:t>200:6, 401:2</w:t>
+            </w:r>
+          </w:p>
+        </w:tc>
+        <w:tc>
+          <w:tcPr>
+            <w:tcW w:type="dxa" w:w="960"/>
+          </w:tcPr>
+          <w:p>
+            <w:r>
+              <w:t>FAIL</w:t>
+            </w:r>
+          </w:p>
+        </w:tc>
+        <w:tc>
+          <w:tcPr>
+            <w:tcW w:type="dxa" w:w="960"/>
+          </w:tcPr>
+          <w:p>
+            <w:r>
+              <w:t>Test failed: text expected to contain /"code":0/(2)</w:t>
+            </w:r>
+          </w:p>
+        </w:tc>
+      </w:tr>
+      <w:tr>
+        <w:tc>
+          <w:tcPr>
+            <w:tcW w:type="dxa" w:w="960"/>
+          </w:tcPr>
+          <w:p>
+            <w:r>
+              <w:t>FUNC-Login</w:t>
+            </w:r>
+          </w:p>
+        </w:tc>
+        <w:tc>
+          <w:tcPr>
+            <w:tcW w:type="dxa" w:w="960"/>
+          </w:tcPr>
+          <w:p>
+            <w:r>
+              <w:t>正向主链路</w:t>
+            </w:r>
+          </w:p>
+        </w:tc>
+        <w:tc>
+          <w:tcPr>
+            <w:tcW w:type="dxa" w:w="960"/>
+          </w:tcPr>
+          <w:p>
+            <w:r>
+              <w:t>期望成功</w:t>
+            </w:r>
+          </w:p>
+        </w:tc>
+        <w:tc>
+          <w:tcPr>
+            <w:tcW w:type="dxa" w:w="960"/>
+          </w:tcPr>
+          <w:p>
+            <w:r>
+              <w:t>8</w:t>
+            </w:r>
+          </w:p>
+        </w:tc>
+        <w:tc>
+          <w:tcPr>
+            <w:tcW w:type="dxa" w:w="960"/>
+          </w:tcPr>
+          <w:p>
+            <w:r>
+              <w:t>6</w:t>
+            </w:r>
+          </w:p>
+        </w:tc>
+        <w:tc>
+          <w:tcPr>
+            <w:tcW w:type="dxa" w:w="960"/>
+          </w:tcPr>
+          <w:p>
+            <w:r>
+              <w:t>2</w:t>
+            </w:r>
+          </w:p>
+        </w:tc>
+        <w:tc>
+          <w:tcPr>
+            <w:tcW w:type="dxa" w:w="960"/>
+          </w:tcPr>
+          <w:p>
+            <w:r>
+              <w:t>200:6, 500:2</w:t>
+            </w:r>
+          </w:p>
+        </w:tc>
+        <w:tc>
+          <w:tcPr>
+            <w:tcW w:type="dxa" w:w="960"/>
+          </w:tcPr>
+          <w:p>
+            <w:r>
+              <w:t>FAIL</w:t>
+            </w:r>
+          </w:p>
+        </w:tc>
+        <w:tc>
+          <w:tcPr>
+            <w:tcW w:type="dxa" w:w="960"/>
+          </w:tcPr>
+          <w:p>
+            <w:r>
+              <w:t>Test failed: text expected to contain /"code":0/(2)</w:t>
+            </w:r>
+          </w:p>
+        </w:tc>
+      </w:tr>
+      <w:tr>
+        <w:tc>
+          <w:tcPr>
+            <w:tcW w:type="dxa" w:w="960"/>
+          </w:tcPr>
+          <w:p>
+            <w:r>
+              <w:t>FUNC-Logout</w:t>
+            </w:r>
+          </w:p>
+        </w:tc>
+        <w:tc>
+          <w:tcPr>
+            <w:tcW w:type="dxa" w:w="960"/>
+          </w:tcPr>
+          <w:p>
+            <w:r>
+              <w:t>正向主链路</w:t>
+            </w:r>
+          </w:p>
+        </w:tc>
+        <w:tc>
+          <w:tcPr>
+            <w:tcW w:type="dxa" w:w="960"/>
+          </w:tcPr>
+          <w:p>
+            <w:r>
+              <w:t>期望成功</w:t>
+            </w:r>
+          </w:p>
+        </w:tc>
+        <w:tc>
+          <w:tcPr>
+            <w:tcW w:type="dxa" w:w="960"/>
+          </w:tcPr>
+          <w:p>
+            <w:r>
+              <w:t>8</w:t>
+            </w:r>
+          </w:p>
+        </w:tc>
+        <w:tc>
+          <w:tcPr>
+            <w:tcW w:type="dxa" w:w="960"/>
+          </w:tcPr>
+          <w:p>
+            <w:r>
+              <w:t>6</w:t>
+            </w:r>
+          </w:p>
+        </w:tc>
+        <w:tc>
+          <w:tcPr>
+            <w:tcW w:type="dxa" w:w="960"/>
+          </w:tcPr>
+          <w:p>
+            <w:r>
+              <w:t>2</w:t>
+            </w:r>
+          </w:p>
+        </w:tc>
+        <w:tc>
+          <w:tcPr>
+            <w:tcW w:type="dxa" w:w="960"/>
+          </w:tcPr>
+          <w:p>
+            <w:r>
+              <w:t>200:6, 401:2</w:t>
+            </w:r>
+          </w:p>
+        </w:tc>
+        <w:tc>
+          <w:tcPr>
+            <w:tcW w:type="dxa" w:w="960"/>
+          </w:tcPr>
+          <w:p>
+            <w:r>
+              <w:t>FAIL</w:t>
+            </w:r>
+          </w:p>
+        </w:tc>
+        <w:tc>
+          <w:tcPr>
+            <w:tcW w:type="dxa" w:w="960"/>
+          </w:tcPr>
+          <w:p>
+            <w:r>
+              <w:t>Test failed: text expected to contain /"code":0/(2)</w:t>
+            </w:r>
+          </w:p>
+        </w:tc>
+      </w:tr>
+      <w:tr>
+        <w:tc>
+          <w:tcPr>
+            <w:tcW w:type="dxa" w:w="960"/>
+          </w:tcPr>
+          <w:p>
+            <w:r>
+              <w:t>FUNC-QueryCourseList</w:t>
+            </w:r>
+          </w:p>
+        </w:tc>
+        <w:tc>
+          <w:tcPr>
+            <w:tcW w:type="dxa" w:w="960"/>
+          </w:tcPr>
+          <w:p>
+            <w:r>
+              <w:t>正向主链路</w:t>
+            </w:r>
+          </w:p>
+        </w:tc>
+        <w:tc>
+          <w:tcPr>
+            <w:tcW w:type="dxa" w:w="960"/>
+          </w:tcPr>
+          <w:p>
+            <w:r>
+              <w:t>期望成功</w:t>
+            </w:r>
+          </w:p>
+        </w:tc>
+        <w:tc>
+          <w:tcPr>
+            <w:tcW w:type="dxa" w:w="960"/>
+          </w:tcPr>
+          <w:p>
+            <w:r>
+              <w:t>8</w:t>
+            </w:r>
+          </w:p>
+        </w:tc>
+        <w:tc>
+          <w:tcPr>
+            <w:tcW w:type="dxa" w:w="960"/>
+          </w:tcPr>
+          <w:p>
+            <w:r>
+              <w:t>6</w:t>
+            </w:r>
+          </w:p>
+        </w:tc>
+        <w:tc>
+          <w:tcPr>
+            <w:tcW w:type="dxa" w:w="960"/>
+          </w:tcPr>
+          <w:p>
+            <w:r>
+              <w:t>2</w:t>
+            </w:r>
+          </w:p>
+        </w:tc>
+        <w:tc>
+          <w:tcPr>
+            <w:tcW w:type="dxa" w:w="960"/>
+          </w:tcPr>
+          <w:p>
+            <w:r>
+              <w:t>200:6, 401:2</w:t>
+            </w:r>
+          </w:p>
+        </w:tc>
+        <w:tc>
+          <w:tcPr>
+            <w:tcW w:type="dxa" w:w="960"/>
+          </w:tcPr>
+          <w:p>
+            <w:r>
+              <w:t>FAIL</w:t>
+            </w:r>
+          </w:p>
+        </w:tc>
+        <w:tc>
+          <w:tcPr>
+            <w:tcW w:type="dxa" w:w="960"/>
+          </w:tcPr>
+          <w:p>
+            <w:r>
+              <w:t>Test failed: text expected to contain /"code":0/(2)</w:t>
+            </w:r>
+          </w:p>
+        </w:tc>
+      </w:tr>
+      <w:tr>
+        <w:tc>
+          <w:tcPr>
+            <w:tcW w:type="dxa" w:w="960"/>
+          </w:tcPr>
+          <w:p>
+            <w:r>
+              <w:t>FUNC-QueryExpGuidebookCatalog</w:t>
+            </w:r>
+          </w:p>
+        </w:tc>
+        <w:tc>
+          <w:tcPr>
+            <w:tcW w:type="dxa" w:w="960"/>
+          </w:tcPr>
+          <w:p>
+            <w:r>
+              <w:t>正向主链路</w:t>
+            </w:r>
+          </w:p>
+        </w:tc>
+        <w:tc>
+          <w:tcPr>
+            <w:tcW w:type="dxa" w:w="960"/>
+          </w:tcPr>
+          <w:p>
+            <w:r>
+              <w:t>期望成功</w:t>
+            </w:r>
+          </w:p>
+        </w:tc>
+        <w:tc>
+          <w:tcPr>
+            <w:tcW w:type="dxa" w:w="960"/>
+          </w:tcPr>
+          <w:p>
+            <w:r>
+              <w:t>6</w:t>
+            </w:r>
+          </w:p>
+        </w:tc>
+        <w:tc>
+          <w:tcPr>
+            <w:tcW w:type="dxa" w:w="960"/>
+          </w:tcPr>
+          <w:p>
+            <w:r>
+              <w:t>6</w:t>
+            </w:r>
+          </w:p>
+        </w:tc>
+        <w:tc>
+          <w:tcPr>
+            <w:tcW w:type="dxa" w:w="960"/>
+          </w:tcPr>
+          <w:p>
+            <w:r>
+              <w:t>0</w:t>
+            </w:r>
+          </w:p>
+        </w:tc>
+        <w:tc>
+          <w:tcPr>
+            <w:tcW w:type="dxa" w:w="960"/>
+          </w:tcPr>
+          <w:p>
+            <w:r>
+              <w:t>200:6</w:t>
+            </w:r>
+          </w:p>
+        </w:tc>
+        <w:tc>
+          <w:tcPr>
+            <w:tcW w:type="dxa" w:w="960"/>
+          </w:tcPr>
+          <w:p>
+            <w:r>
+              <w:t>PASS</w:t>
+            </w:r>
+          </w:p>
+        </w:tc>
+        <w:tc>
+          <w:tcPr>
+            <w:tcW w:type="dxa" w:w="960"/>
+          </w:tcPr>
+          <w:p>
+            <w:r>
+              <w:t>-</w:t>
+            </w:r>
+          </w:p>
+        </w:tc>
+      </w:tr>
+      <w:tr>
+        <w:tc>
+          <w:tcPr>
+            <w:tcW w:type="dxa" w:w="960"/>
+          </w:tcPr>
+          <w:p>
+            <w:r>
+              <w:t>FUNC-QueryExpGuidebookContent</w:t>
+            </w:r>
+          </w:p>
+        </w:tc>
+        <w:tc>
+          <w:tcPr>
+            <w:tcW w:type="dxa" w:w="960"/>
+          </w:tcPr>
+          <w:p>
+            <w:r>
+              <w:t>正向主链路</w:t>
+            </w:r>
+          </w:p>
+        </w:tc>
+        <w:tc>
+          <w:tcPr>
+            <w:tcW w:type="dxa" w:w="960"/>
+          </w:tcPr>
+          <w:p>
+            <w:r>
+              <w:t>期望成功</w:t>
+            </w:r>
+          </w:p>
+        </w:tc>
+        <w:tc>
+          <w:tcPr>
+            <w:tcW w:type="dxa" w:w="960"/>
+          </w:tcPr>
+          <w:p>
+            <w:r>
+              <w:t>6</w:t>
+            </w:r>
+          </w:p>
+        </w:tc>
+        <w:tc>
+          <w:tcPr>
+            <w:tcW w:type="dxa" w:w="960"/>
+          </w:tcPr>
+          <w:p>
+            <w:r>
+              <w:t>6</w:t>
+            </w:r>
+          </w:p>
+        </w:tc>
+        <w:tc>
+          <w:tcPr>
+            <w:tcW w:type="dxa" w:w="960"/>
+          </w:tcPr>
+          <w:p>
+            <w:r>
+              <w:t>0</w:t>
+            </w:r>
+          </w:p>
+        </w:tc>
+        <w:tc>
+          <w:tcPr>
+            <w:tcW w:type="dxa" w:w="960"/>
+          </w:tcPr>
+          <w:p>
+            <w:r>
+              <w:t>200:6</w:t>
+            </w:r>
+          </w:p>
+        </w:tc>
+        <w:tc>
+          <w:tcPr>
+            <w:tcW w:type="dxa" w:w="960"/>
+          </w:tcPr>
+          <w:p>
+            <w:r>
+              <w:t>PASS</w:t>
+            </w:r>
+          </w:p>
+        </w:tc>
+        <w:tc>
+          <w:tcPr>
+            <w:tcW w:type="dxa" w:w="960"/>
+          </w:tcPr>
+          <w:p>
+            <w:r>
+              <w:t>-</w:t>
+            </w:r>
+          </w:p>
+        </w:tc>
+      </w:tr>
+      <w:tr>
+        <w:tc>
+          <w:tcPr>
+            <w:tcW w:type="dxa" w:w="960"/>
+          </w:tcPr>
+          <w:p>
+            <w:r>
+              <w:t>FUNC-QuitCourse</w:t>
+            </w:r>
+          </w:p>
+        </w:tc>
+        <w:tc>
+          <w:tcPr>
+            <w:tcW w:type="dxa" w:w="960"/>
+          </w:tcPr>
+          <w:p>
+            <w:r>
+              <w:t>正向主链路</w:t>
+            </w:r>
+          </w:p>
+        </w:tc>
+        <w:tc>
+          <w:tcPr>
+            <w:tcW w:type="dxa" w:w="960"/>
+          </w:tcPr>
+          <w:p>
+            <w:r>
+              <w:t>期望成功</w:t>
+            </w:r>
+          </w:p>
+        </w:tc>
+        <w:tc>
+          <w:tcPr>
+            <w:tcW w:type="dxa" w:w="960"/>
+          </w:tcPr>
+          <w:p>
+            <w:r>
+              <w:t>8</w:t>
+            </w:r>
+          </w:p>
+        </w:tc>
+        <w:tc>
+          <w:tcPr>
+            <w:tcW w:type="dxa" w:w="960"/>
+          </w:tcPr>
+          <w:p>
+            <w:r>
+              <w:t>6</w:t>
+            </w:r>
+          </w:p>
+        </w:tc>
+        <w:tc>
+          <w:tcPr>
+            <w:tcW w:type="dxa" w:w="960"/>
+          </w:tcPr>
+          <w:p>
+            <w:r>
+              <w:t>2</w:t>
+            </w:r>
+          </w:p>
+        </w:tc>
+        <w:tc>
+          <w:tcPr>
+            <w:tcW w:type="dxa" w:w="960"/>
+          </w:tcPr>
+          <w:p>
+            <w:r>
+              <w:t>200:6, 401:2</w:t>
+            </w:r>
+          </w:p>
+        </w:tc>
+        <w:tc>
+          <w:tcPr>
+            <w:tcW w:type="dxa" w:w="960"/>
+          </w:tcPr>
+          <w:p>
+            <w:r>
+              <w:t>FAIL</w:t>
+            </w:r>
+          </w:p>
+        </w:tc>
+        <w:tc>
+          <w:tcPr>
+            <w:tcW w:type="dxa" w:w="960"/>
+          </w:tcPr>
+          <w:p>
+            <w:r>
+              <w:t>Test failed: text expected to contain /"code":0/(2)</w:t>
+            </w:r>
+          </w:p>
+        </w:tc>
+      </w:tr>
+      <w:tr>
+        <w:tc>
+          <w:tcPr>
+            <w:tcW w:type="dxa" w:w="960"/>
+          </w:tcPr>
+          <w:p>
+            <w:r>
+              <w:t>FUNC-QuitTeachingTask</w:t>
+            </w:r>
+          </w:p>
+        </w:tc>
+        <w:tc>
+          <w:tcPr>
+            <w:tcW w:type="dxa" w:w="960"/>
+          </w:tcPr>
+          <w:p>
+            <w:r>
+              <w:t>正向主链路</w:t>
+            </w:r>
+          </w:p>
+        </w:tc>
+        <w:tc>
+          <w:tcPr>
+            <w:tcW w:type="dxa" w:w="960"/>
+          </w:tcPr>
+          <w:p>
+            <w:r>
+              <w:t>期望成功</w:t>
+            </w:r>
+          </w:p>
+        </w:tc>
+        <w:tc>
+          <w:tcPr>
+            <w:tcW w:type="dxa" w:w="960"/>
+          </w:tcPr>
+          <w:p>
+            <w:r>
+              <w:t>8</w:t>
+            </w:r>
+          </w:p>
+        </w:tc>
+        <w:tc>
+          <w:tcPr>
+            <w:tcW w:type="dxa" w:w="960"/>
+          </w:tcPr>
+          <w:p>
+            <w:r>
+              <w:t>6</w:t>
+            </w:r>
+          </w:p>
+        </w:tc>
+        <w:tc>
+          <w:tcPr>
+            <w:tcW w:type="dxa" w:w="960"/>
+          </w:tcPr>
+          <w:p>
+            <w:r>
+              <w:t>2</w:t>
+            </w:r>
+          </w:p>
+        </w:tc>
+        <w:tc>
+          <w:tcPr>
+            <w:tcW w:type="dxa" w:w="960"/>
+          </w:tcPr>
+          <w:p>
+            <w:r>
+              <w:t>200:6, 401:2</w:t>
+            </w:r>
+          </w:p>
+        </w:tc>
+        <w:tc>
+          <w:tcPr>
+            <w:tcW w:type="dxa" w:w="960"/>
+          </w:tcPr>
+          <w:p>
+            <w:r>
+              <w:t>FAIL</w:t>
+            </w:r>
+          </w:p>
+        </w:tc>
+        <w:tc>
+          <w:tcPr>
+            <w:tcW w:type="dxa" w:w="960"/>
+          </w:tcPr>
+          <w:p>
+            <w:r>
+              <w:t>Test failed: text expected to contain /"code":0/(2)</w:t>
+            </w:r>
+          </w:p>
+        </w:tc>
+      </w:tr>
+      <w:tr>
+        <w:tc>
+          <w:tcPr>
+            <w:tcW w:type="dxa" w:w="960"/>
+          </w:tcPr>
+          <w:p>
+            <w:r>
+              <w:t>FUNC-SaveExpAnswerRecord</w:t>
+            </w:r>
+          </w:p>
+        </w:tc>
+        <w:tc>
+          <w:tcPr>
+            <w:tcW w:type="dxa" w:w="960"/>
+          </w:tcPr>
+          <w:p>
+            <w:r>
+              <w:t>正向主链路</w:t>
+            </w:r>
+          </w:p>
+        </w:tc>
+        <w:tc>
+          <w:tcPr>
+            <w:tcW w:type="dxa" w:w="960"/>
+          </w:tcPr>
+          <w:p>
+            <w:r>
+              <w:t>期望成功</w:t>
+            </w:r>
+          </w:p>
+        </w:tc>
+        <w:tc>
+          <w:tcPr>
+            <w:tcW w:type="dxa" w:w="960"/>
+          </w:tcPr>
+          <w:p>
+            <w:r>
+              <w:t>6</w:t>
+            </w:r>
+          </w:p>
+        </w:tc>
+        <w:tc>
+          <w:tcPr>
+            <w:tcW w:type="dxa" w:w="960"/>
+          </w:tcPr>
+          <w:p>
+            <w:r>
+              <w:t>6</w:t>
+            </w:r>
+          </w:p>
+        </w:tc>
+        <w:tc>
+          <w:tcPr>
+            <w:tcW w:type="dxa" w:w="960"/>
+          </w:tcPr>
+          <w:p>
+            <w:r>
+              <w:t>0</w:t>
+            </w:r>
+          </w:p>
+        </w:tc>
+        <w:tc>
+          <w:tcPr>
+            <w:tcW w:type="dxa" w:w="960"/>
+          </w:tcPr>
+          <w:p>
+            <w:r>
+              <w:t>200:6</w:t>
+            </w:r>
+          </w:p>
+        </w:tc>
+        <w:tc>
+          <w:tcPr>
+            <w:tcW w:type="dxa" w:w="960"/>
+          </w:tcPr>
+          <w:p>
+            <w:r>
+              <w:t>PASS</w:t>
+            </w:r>
+          </w:p>
+        </w:tc>
+        <w:tc>
+          <w:tcPr>
+            <w:tcW w:type="dxa" w:w="960"/>
+          </w:tcPr>
+          <w:p>
+            <w:r>
+              <w:t>-</w:t>
+            </w:r>
+          </w:p>
+        </w:tc>
+      </w:tr>
+      <w:tr>
+        <w:tc>
+          <w:tcPr>
+            <w:tcW w:type="dxa" w:w="960"/>
+          </w:tcPr>
+          <w:p>
+            <w:r>
+              <w:t>FUNC-saveQuestionAnswer</w:t>
+            </w:r>
+          </w:p>
+        </w:tc>
+        <w:tc>
+          <w:tcPr>
+            <w:tcW w:type="dxa" w:w="960"/>
+          </w:tcPr>
+          <w:p>
+            <w:r>
+              <w:t>正向主链路</w:t>
+            </w:r>
+          </w:p>
+        </w:tc>
+        <w:tc>
+          <w:tcPr>
+            <w:tcW w:type="dxa" w:w="960"/>
+          </w:tcPr>
+          <w:p>
+            <w:r>
+              <w:t>期望成功</w:t>
+            </w:r>
+          </w:p>
+        </w:tc>
+        <w:tc>
+          <w:tcPr>
+            <w:tcW w:type="dxa" w:w="960"/>
+          </w:tcPr>
+          <w:p>
+            <w:r>
+              <w:t>6</w:t>
+            </w:r>
+          </w:p>
+        </w:tc>
+        <w:tc>
+          <w:tcPr>
+            <w:tcW w:type="dxa" w:w="960"/>
+          </w:tcPr>
+          <w:p>
+            <w:r>
+              <w:t>6</w:t>
+            </w:r>
+          </w:p>
+        </w:tc>
+        <w:tc>
+          <w:tcPr>
+            <w:tcW w:type="dxa" w:w="960"/>
+          </w:tcPr>
+          <w:p>
+            <w:r>
+              <w:t>0</w:t>
+            </w:r>
+          </w:p>
+        </w:tc>
+        <w:tc>
+          <w:tcPr>
+            <w:tcW w:type="dxa" w:w="960"/>
+          </w:tcPr>
+          <w:p>
+            <w:r>
+              <w:t>200:6</w:t>
+            </w:r>
+          </w:p>
+        </w:tc>
+        <w:tc>
+          <w:tcPr>
+            <w:tcW w:type="dxa" w:w="960"/>
+          </w:tcPr>
+          <w:p>
+            <w:r>
+              <w:t>PASS</w:t>
+            </w:r>
+          </w:p>
+        </w:tc>
+        <w:tc>
+          <w:tcPr>
+            <w:tcW w:type="dxa" w:w="960"/>
+          </w:tcPr>
+          <w:p>
+            <w:r>
+              <w:t>-</w:t>
+            </w:r>
+          </w:p>
+        </w:tc>
+      </w:tr>
+      <w:tr>
+        <w:tc>
+          <w:tcPr>
+            <w:tcW w:type="dxa" w:w="960"/>
+          </w:tcPr>
+          <w:p>
+            <w:r>
+              <w:t>KA-Heartbeat</w:t>
+            </w:r>
+          </w:p>
+        </w:tc>
+        <w:tc>
+          <w:tcPr>
+            <w:tcW w:type="dxa" w:w="960"/>
+          </w:tcPr>
+          <w:p>
+            <w:r>
+              <w:t>会话时序</w:t>
+            </w:r>
+          </w:p>
+        </w:tc>
+        <w:tc>
+          <w:tcPr>
+            <w:tcW w:type="dxa" w:w="960"/>
+          </w:tcPr>
+          <w:p>
+            <w:r>
+              <w:t>期望成功</w:t>
+            </w:r>
+          </w:p>
+        </w:tc>
+        <w:tc>
+          <w:tcPr>
+            <w:tcW w:type="dxa" w:w="960"/>
+          </w:tcPr>
+          <w:p>
+            <w:r>
+              <w:t>12</w:t>
+            </w:r>
+          </w:p>
+        </w:tc>
+        <w:tc>
+          <w:tcPr>
+            <w:tcW w:type="dxa" w:w="960"/>
+          </w:tcPr>
+          <w:p>
+            <w:r>
+              <w:t>12</w:t>
+            </w:r>
+          </w:p>
+        </w:tc>
+        <w:tc>
+          <w:tcPr>
+            <w:tcW w:type="dxa" w:w="960"/>
+          </w:tcPr>
+          <w:p>
+            <w:r>
+              <w:t>0</w:t>
+            </w:r>
+          </w:p>
+        </w:tc>
+        <w:tc>
+          <w:tcPr>
+            <w:tcW w:type="dxa" w:w="960"/>
+          </w:tcPr>
+          <w:p>
+            <w:r>
+              <w:t>200:12</w:t>
+            </w:r>
+          </w:p>
+        </w:tc>
+        <w:tc>
+          <w:tcPr>
+            <w:tcW w:type="dxa" w:w="960"/>
+          </w:tcPr>
+          <w:p>
+            <w:r>
+              <w:t>PASS</w:t>
+            </w:r>
+          </w:p>
+        </w:tc>
+        <w:tc>
+          <w:tcPr>
+            <w:tcW w:type="dxa" w:w="960"/>
+          </w:tcPr>
+          <w:p>
+            <w:r>
+              <w:t>-</w:t>
+            </w:r>
+          </w:p>
+        </w:tc>
+      </w:tr>
+      <w:tr>
+        <w:tc>
+          <w:tcPr>
+            <w:tcW w:type="dxa" w:w="960"/>
+          </w:tcPr>
+          <w:p>
+            <w:r>
+              <w:t>KA-Heartbeat-AfterExpire [EXPECT_FAIL]</w:t>
+            </w:r>
+          </w:p>
+        </w:tc>
+        <w:tc>
+          <w:tcPr>
+            <w:tcW w:type="dxa" w:w="960"/>
+          </w:tcPr>
+          <w:p>
+            <w:r>
+              <w:t>会话时序</w:t>
+            </w:r>
+          </w:p>
+        </w:tc>
+        <w:tc>
+          <w:tcPr>
+            <w:tcW w:type="dxa" w:w="960"/>
+          </w:tcPr>
+          <w:p>
+            <w:r>
+              <w:t>期望失败</w:t>
+            </w:r>
+          </w:p>
+        </w:tc>
+        <w:tc>
+          <w:tcPr>
+            <w:tcW w:type="dxa" w:w="960"/>
+          </w:tcPr>
+          <w:p>
+            <w:r>
+              <w:t>2</w:t>
+            </w:r>
+          </w:p>
+        </w:tc>
+        <w:tc>
+          <w:tcPr>
+            <w:tcW w:type="dxa" w:w="960"/>
+          </w:tcPr>
+          <w:p>
+            <w:r>
+              <w:t>0</w:t>
+            </w:r>
+          </w:p>
+        </w:tc>
+        <w:tc>
+          <w:tcPr>
+            <w:tcW w:type="dxa" w:w="960"/>
+          </w:tcPr>
+          <w:p>
+            <w:r>
+              <w:t>2</w:t>
+            </w:r>
+          </w:p>
+        </w:tc>
+        <w:tc>
+          <w:tcPr>
+            <w:tcW w:type="dxa" w:w="960"/>
+          </w:tcPr>
+          <w:p>
+            <w:r>
+              <w:t>200:2</w:t>
+            </w:r>
+          </w:p>
+        </w:tc>
+        <w:tc>
+          <w:tcPr>
+            <w:tcW w:type="dxa" w:w="960"/>
+          </w:tcPr>
+          <w:p>
+            <w:r>
+              <w:t>FAIL</w:t>
+            </w:r>
+          </w:p>
+        </w:tc>
+        <w:tc>
+          <w:tcPr>
+            <w:tcW w:type="dxa" w:w="960"/>
+          </w:tcPr>
+          <w:p>
+            <w:r>
+              <w:t>Expected failure but got success: KA-Heartbeat-AfterExpire [EXPECT_FAIL](2)</w:t>
+            </w:r>
+          </w:p>
+        </w:tc>
+      </w:tr>
+      <w:tr>
+        <w:tc>
+          <w:tcPr>
+            <w:tcW w:type="dxa" w:w="960"/>
+          </w:tcPr>
+          <w:p>
+            <w:r>
+              <w:t>KA-Login</w:t>
+            </w:r>
+          </w:p>
+        </w:tc>
+        <w:tc>
+          <w:tcPr>
+            <w:tcW w:type="dxa" w:w="960"/>
+          </w:tcPr>
+          <w:p>
+            <w:r>
+              <w:t>会话时序</w:t>
+            </w:r>
+          </w:p>
+        </w:tc>
+        <w:tc>
+          <w:tcPr>
+            <w:tcW w:type="dxa" w:w="960"/>
+          </w:tcPr>
+          <w:p>
+            <w:r>
+              <w:t>期望成功</w:t>
+            </w:r>
+          </w:p>
+        </w:tc>
+        <w:tc>
+          <w:tcPr>
+            <w:tcW w:type="dxa" w:w="960"/>
+          </w:tcPr>
+          <w:p>
+            <w:r>
+              <w:t>2</w:t>
+            </w:r>
+          </w:p>
+        </w:tc>
+        <w:tc>
+          <w:tcPr>
+            <w:tcW w:type="dxa" w:w="960"/>
+          </w:tcPr>
+          <w:p>
+            <w:r>
+              <w:t>2</w:t>
+            </w:r>
+          </w:p>
+        </w:tc>
+        <w:tc>
+          <w:tcPr>
+            <w:tcW w:type="dxa" w:w="960"/>
+          </w:tcPr>
+          <w:p>
+            <w:r>
+              <w:t>0</w:t>
+            </w:r>
+          </w:p>
+        </w:tc>
+        <w:tc>
+          <w:tcPr>
+            <w:tcW w:type="dxa" w:w="960"/>
+          </w:tcPr>
+          <w:p>
+            <w:r>
+              <w:t>200:2</w:t>
+            </w:r>
+          </w:p>
+        </w:tc>
+        <w:tc>
+          <w:tcPr>
+            <w:tcW w:type="dxa" w:w="960"/>
+          </w:tcPr>
+          <w:p>
+            <w:r>
+              <w:t>PASS</w:t>
+            </w:r>
+          </w:p>
+        </w:tc>
+        <w:tc>
+          <w:tcPr>
+            <w:tcW w:type="dxa" w:w="960"/>
+          </w:tcPr>
+          <w:p>
+            <w:r>
+              <w:t>-</w:t>
+            </w:r>
+          </w:p>
+        </w:tc>
+      </w:tr>
+      <w:tr>
+        <w:tc>
+          <w:tcPr>
+            <w:tcW w:type="dxa" w:w="960"/>
+          </w:tcPr>
+          <w:p>
+            <w:r>
+              <w:t>KA-QueryCourseList-AfterExpire [EXPECT_FAIL]</w:t>
+            </w:r>
+          </w:p>
+        </w:tc>
+        <w:tc>
+          <w:tcPr>
+            <w:tcW w:type="dxa" w:w="960"/>
+          </w:tcPr>
+          <w:p>
+            <w:r>
+              <w:t>会话时序</w:t>
+            </w:r>
+          </w:p>
+        </w:tc>
+        <w:tc>
+          <w:tcPr>
+            <w:tcW w:type="dxa" w:w="960"/>
+          </w:tcPr>
+          <w:p>
+            <w:r>
+              <w:t>期望失败</w:t>
+            </w:r>
+          </w:p>
+        </w:tc>
+        <w:tc>
+          <w:tcPr>
+            <w:tcW w:type="dxa" w:w="960"/>
+          </w:tcPr>
+          <w:p>
+            <w:r>
+              <w:t>2</w:t>
+            </w:r>
+          </w:p>
+        </w:tc>
+        <w:tc>
+          <w:tcPr>
+            <w:tcW w:type="dxa" w:w="960"/>
+          </w:tcPr>
+          <w:p>
+            <w:r>
+              <w:t>0</w:t>
+            </w:r>
+          </w:p>
+        </w:tc>
+        <w:tc>
+          <w:tcPr>
+            <w:tcW w:type="dxa" w:w="960"/>
+          </w:tcPr>
+          <w:p>
+            <w:r>
+              <w:t>2</w:t>
+            </w:r>
+          </w:p>
+        </w:tc>
+        <w:tc>
+          <w:tcPr>
+            <w:tcW w:type="dxa" w:w="960"/>
+          </w:tcPr>
+          <w:p>
+            <w:r>
+              <w:t>200:2</w:t>
+            </w:r>
+          </w:p>
+        </w:tc>
+        <w:tc>
+          <w:tcPr>
+            <w:tcW w:type="dxa" w:w="960"/>
+          </w:tcPr>
+          <w:p>
+            <w:r>
+              <w:t>FAIL</w:t>
+            </w:r>
+          </w:p>
+        </w:tc>
+        <w:tc>
+          <w:tcPr>
+            <w:tcW w:type="dxa" w:w="960"/>
+          </w:tcPr>
+          <w:p>
+            <w:r>
+              <w:t>Expected failure but got success: KA-QueryCourseList-AfterExpire [EXPECT_FAIL](2)</w:t>
+            </w:r>
+          </w:p>
+        </w:tc>
+      </w:tr>
+      <w:tr>
+        <w:tc>
+          <w:tcPr>
+            <w:tcW w:type="dxa" w:w="960"/>
+          </w:tcPr>
+          <w:p>
+            <w:r>
+              <w:t>KA-QueryCourseList-AfterExpiredHeartbeat [EXPECT_FAIL]</w:t>
+            </w:r>
+          </w:p>
+        </w:tc>
+        <w:tc>
+          <w:tcPr>
+            <w:tcW w:type="dxa" w:w="960"/>
+          </w:tcPr>
+          <w:p>
+            <w:r>
+              <w:t>会话时序</w:t>
+            </w:r>
+          </w:p>
+        </w:tc>
+        <w:tc>
+          <w:tcPr>
+            <w:tcW w:type="dxa" w:w="960"/>
+          </w:tcPr>
+          <w:p>
+            <w:r>
+              <w:t>期望失败</w:t>
+            </w:r>
+          </w:p>
+        </w:tc>
+        <w:tc>
+          <w:tcPr>
+            <w:tcW w:type="dxa" w:w="960"/>
+          </w:tcPr>
+          <w:p>
+            <w:r>
+              <w:t>2</w:t>
+            </w:r>
+          </w:p>
+        </w:tc>
+        <w:tc>
+          <w:tcPr>
+            <w:tcW w:type="dxa" w:w="960"/>
+          </w:tcPr>
+          <w:p>
+            <w:r>
+              <w:t>0</w:t>
+            </w:r>
+          </w:p>
+        </w:tc>
+        <w:tc>
+          <w:tcPr>
+            <w:tcW w:type="dxa" w:w="960"/>
+          </w:tcPr>
+          <w:p>
+            <w:r>
+              <w:t>2</w:t>
+            </w:r>
+          </w:p>
+        </w:tc>
+        <w:tc>
+          <w:tcPr>
+            <w:tcW w:type="dxa" w:w="960"/>
+          </w:tcPr>
+          <w:p>
+            <w:r>
+              <w:t>200:2</w:t>
+            </w:r>
+          </w:p>
+        </w:tc>
+        <w:tc>
+          <w:tcPr>
+            <w:tcW w:type="dxa" w:w="960"/>
+          </w:tcPr>
+          <w:p>
+            <w:r>
+              <w:t>FAIL</w:t>
+            </w:r>
+          </w:p>
+        </w:tc>
+        <w:tc>
+          <w:tcPr>
+            <w:tcW w:type="dxa" w:w="960"/>
+          </w:tcPr>
+          <w:p>
+            <w:r>
+              <w:t>Expected failure but got success: KA-QueryCourseList-AfterExpiredHeartbeat [EXPECT_FAIL](2)</w:t>
+            </w:r>
+          </w:p>
+        </w:tc>
+      </w:tr>
+      <w:tr>
+        <w:tc>
+          <w:tcPr>
+            <w:tcW w:type="dxa" w:w="960"/>
+          </w:tcPr>
+          <w:p>
+            <w:r>
+              <w:t>KA-QueryCourseList-Alive [EXPECT_OK]</w:t>
+            </w:r>
+          </w:p>
+        </w:tc>
+        <w:tc>
+          <w:tcPr>
+            <w:tcW w:type="dxa" w:w="960"/>
+          </w:tcPr>
+          <w:p>
+            <w:r>
+              <w:t>会话时序</w:t>
+            </w:r>
+          </w:p>
+        </w:tc>
+        <w:tc>
+          <w:tcPr>
+            <w:tcW w:type="dxa" w:w="960"/>
+          </w:tcPr>
+          <w:p>
+            <w:r>
+              <w:t>期望成功</w:t>
+            </w:r>
+          </w:p>
+        </w:tc>
+        <w:tc>
+          <w:tcPr>
+            <w:tcW w:type="dxa" w:w="960"/>
+          </w:tcPr>
+          <w:p>
+            <w:r>
+              <w:t>2</w:t>
+            </w:r>
+          </w:p>
+        </w:tc>
+        <w:tc>
+          <w:tcPr>
+            <w:tcW w:type="dxa" w:w="960"/>
+          </w:tcPr>
+          <w:p>
+            <w:r>
+              <w:t>2</w:t>
+            </w:r>
+          </w:p>
+        </w:tc>
+        <w:tc>
+          <w:tcPr>
+            <w:tcW w:type="dxa" w:w="960"/>
+          </w:tcPr>
+          <w:p>
+            <w:r>
+              <w:t>0</w:t>
+            </w:r>
+          </w:p>
+        </w:tc>
+        <w:tc>
+          <w:tcPr>
+            <w:tcW w:type="dxa" w:w="960"/>
+          </w:tcPr>
+          <w:p>
+            <w:r>
+              <w:t>200:2</w:t>
+            </w:r>
+          </w:p>
+        </w:tc>
+        <w:tc>
+          <w:tcPr>
+            <w:tcW w:type="dxa" w:w="960"/>
+          </w:tcPr>
+          <w:p>
+            <w:r>
+              <w:t>PASS</w:t>
+            </w:r>
+          </w:p>
+        </w:tc>
+        <w:tc>
+          <w:tcPr>
+            <w:tcW w:type="dxa" w:w="960"/>
+          </w:tcPr>
+          <w:p>
+            <w:r>
+              <w:t>-</w:t>
+            </w:r>
+          </w:p>
+        </w:tc>
+      </w:tr>
+    </w:tbl>
+    <w:p/>
+    <w:p/>
+    <w:p>
+      <w:r>
+        <w:t>6.6 关键图表</w:t>
       </w:r>
     </w:p>
     <w:p>
@@ -2862,7 +6410,7 @@
           </w:tcPr>
           <w:p>
             <w:r>
-              <w:t>7</w:t>
+              <w:t>5</w:t>
             </w:r>
           </w:p>
         </w:tc>
@@ -2906,7 +6454,7 @@
           </w:tcPr>
           <w:p>
             <w:r>
-              <w:t>1</w:t>
+              <w:t>0</w:t>
             </w:r>
           </w:p>
         </w:tc>
@@ -2920,28 +6468,43 @@
       </w:r>
     </w:p>
     <w:p>
+      <w:pPr>
+        <w:pStyle w:val="ListNumber"/>
+      </w:pPr>
       <w:r>
-        <w:t>1. [严重] 登录/认证 - FUNC-Login 在 4 账号中 2 账号失败，HTTP 500（2/4），导致正向主链路中断</w:t>
+        <w:t>1. [严重] 登录/认证 - FUNC-Login 出现失败 2/8，状态码分布 {'500': 2, '200': 6}，包含 HTTP 500。</w:t>
       </w:r>
     </w:p>
     <w:p>
+      <w:pPr>
+        <w:pStyle w:val="ListNumber"/>
+      </w:pPr>
       <w:r>
-        <w:t>2. [严重] 登录态/鉴权 - FUNC-QueryCourseList/FUNC-GetCourseChapterTaskList/FUNC-QuitTeachingTask/FUNC-QuitCourse/FUNC-Logout 出现 401（各 2/4），与前序登录失败链路强相关</w:t>
+        <w:t>2. [严重] 登录态/鉴权链路 - 主链路鉴权相关接口失败 10/40，状态码分布 {'401': 10, '200': 30}，出现 401 Unauthorized。</w:t>
       </w:r>
     </w:p>
     <w:p>
+      <w:pPr>
+        <w:pStyle w:val="ListNumber"/>
+      </w:pPr>
       <w:r>
-        <w:t>3. [严重] 异常处理 - EX-NoAuth-QueryCourseList[EXPECT_FAIL] 返回 HTTP 500（1/1），异常拦截场景暴露服务端错误而非规范业务失败</w:t>
+        <w:t>3. [严重] 异常处理规范 - EX-NoAuth-QueryCourseList [EXPECT_FAIL] 失败 2/2，返回 HTTP 500，且命中服务端异常特征。</w:t>
       </w:r>
     </w:p>
     <w:p>
+      <w:pPr>
+        <w:pStyle w:val="ListNumber"/>
+      </w:pPr>
       <w:r>
-        <w:t>4. [严重] 会话时序 - KA-QueryCourseList-AfterExpire / KA-Heartbeat-AfterExpire / KA-QueryCourseList-AfterExpiredHeartbeat 在 EXPECT_FAIL 场景返回 200（各 1/1），疑似 Token 过期机制校验失效</w:t>
+        <w:t>4. [严重] Header/版本兼容 - clientKey/clientkey 与 clientVersion 兼容性 EXPECT_OK 场景失败 10/10，状态码分布 {'424': 10}。</w:t>
       </w:r>
     </w:p>
     <w:p>
+      <w:pPr>
+        <w:pStyle w:val="ListNumber"/>
+      </w:pPr>
       <w:r>
-        <w:t>5. [严重] 性能-登录 - PERF-001-login 压测错误率 20.00%（10654/53267），失败主要为 HTTP 500 Internal Server Error</w:t>
+        <w:t>5. [严重] 会话时序/Token过期 - KA 过期后校验 EXPECT_FAIL 场景失败 6/6，均返回 HTTP 200，疑似过期机制未按预期生效。</w:t>
       </w:r>
     </w:p>
     <w:p>

</xml_diff>